<commit_message>
Preserve pending app and backend updates before sync
Commit the remaining local desktop_app, modern_backend, migration, update, and document changes so the branch can be safely reconciled with origin/main without discarding work.

A safety branch was created before staging these files. The pending text files were scanned for obvious credentials before committing.

Co-authored-by: Copilot <223556219+Copilot@users.noreply.github.com>
</commit_message>
<xml_diff>
--- a/forms/templates/confirmationletter.docx
+++ b/forms/templates/confirmationletter.docx
@@ -1,6 +1,6 @@
 
 <file path=word/document.xml><?xml version="1.0" encoding="utf-8"?>
-<w:document xmlns:wpc="http://schemas.microsoft.com/office/word/2010/wordprocessingCanvas" xmlns:cx="http://schemas.microsoft.com/office/drawing/2014/chartex" xmlns:cx1="http://schemas.microsoft.com/office/drawing/2015/9/8/chartex" xmlns:cx2="http://schemas.microsoft.com/office/drawing/2015/10/21/chartex" xmlns:cx3="http://schemas.microsoft.com/office/drawing/2016/5/9/chartex" xmlns:cx4="http://schemas.microsoft.com/office/drawing/2016/5/10/chartex" xmlns:cx5="http://schemas.microsoft.com/office/drawing/2016/5/11/chartex" xmlns:cx6="http://schemas.microsoft.com/office/drawing/2016/5/12/chartex" xmlns:cx7="http://schemas.microsoft.com/office/drawing/2016/5/13/chartex" xmlns:cx8="http://schemas.microsoft.com/office/drawing/2016/5/14/chartex" xmlns:mc="http://schemas.openxmlformats.org/markup-compatibility/2006" xmlns:aink="http://schemas.microsoft.com/office/drawing/2016/ink" xmlns:am3d="http://schemas.microsoft.com/office/drawing/2017/model3d" xmlns:o="urn:schemas-microsoft-com:office:office" xmlns:oel="http://schemas.microsoft.com/office/2019/extlst" xmlns:r="http://schemas.openxmlformats.org/officeDocument/2006/relationships" xmlns:m="http://schemas.openxmlformats.org/officeDocument/2006/math" xmlns:v="urn:schemas-microsoft-com:vml" xmlns:wp14="http://schemas.microsoft.com/office/word/2010/wordprocessingDrawing" xmlns:wp="http://schemas.openxmlformats.org/drawingml/2006/wordprocessingDrawing" xmlns:w10="urn:schemas-microsoft-com:office:word" xmlns:w="http://schemas.openxmlformats.org/wordprocessingml/2006/main" xmlns:w14="http://schemas.microsoft.com/office/word/2010/wordml" xmlns:w15="http://schemas.microsoft.com/office/word/2012/wordml" xmlns:w16cei="http://schemas.microsoft.com/office/word/2026/wordml/cei" xmlns:w16cex="http://schemas.microsoft.com/office/word/2018/wordml/cex" xmlns:w16cid="http://schemas.microsoft.com/office/word/2016/wordml/cid" xmlns:w16="http://schemas.microsoft.com/office/word/2018/wordml" xmlns:w16du="http://schemas.microsoft.com/office/word/2023/wordml/word16du" xmlns:w16sdtdh="http://schemas.microsoft.com/office/word/2020/wordml/sdtdatahash" xmlns:w16sdtfl="http://schemas.microsoft.com/office/word/2024/wordml/sdtformatlock" xmlns:w16se="http://schemas.microsoft.com/office/word/2015/wordml/symex" xmlns:wpg="http://schemas.microsoft.com/office/word/2010/wordprocessingGroup" xmlns:wpi="http://schemas.microsoft.com/office/word/2010/wordprocessingInk" xmlns:wne="http://schemas.microsoft.com/office/word/2006/wordml" xmlns:wps="http://schemas.microsoft.com/office/word/2010/wordprocessingShape" mc:Ignorable="w14 w15 w16se w16cid w16 w16cex w16sdtdh w16sdtfl w16du wp14">
+<w:document xmlns:wpc="http://schemas.microsoft.com/office/word/2010/wordprocessingCanvas" xmlns:cx="http://schemas.microsoft.com/office/drawing/2014/chartex" xmlns:cx1="http://schemas.microsoft.com/office/drawing/2015/9/8/chartex" xmlns:cx2="http://schemas.microsoft.com/office/drawing/2015/10/21/chartex" xmlns:cx3="http://schemas.microsoft.com/office/drawing/2016/5/9/chartex" xmlns:cx4="http://schemas.microsoft.com/office/drawing/2016/5/10/chartex" xmlns:cx5="http://schemas.microsoft.com/office/drawing/2016/5/11/chartex" xmlns:cx6="http://schemas.microsoft.com/office/drawing/2016/5/12/chartex" xmlns:cx7="http://schemas.microsoft.com/office/drawing/2016/5/13/chartex" xmlns:cx8="http://schemas.microsoft.com/office/drawing/2016/5/14/chartex" xmlns:mc="http://schemas.openxmlformats.org/markup-compatibility/2006" xmlns:aink="http://schemas.microsoft.com/office/drawing/2016/ink" xmlns:am3d="http://schemas.microsoft.com/office/drawing/2017/model3d" xmlns:o="urn:schemas-microsoft-com:office:office" xmlns:oel="http://schemas.microsoft.com/office/2019/extlst" xmlns:r="http://schemas.openxmlformats.org/officeDocument/2006/relationships" xmlns:m="http://schemas.openxmlformats.org/officeDocument/2006/math" xmlns:v="urn:schemas-microsoft-com:vml" xmlns:wp14="http://schemas.microsoft.com/office/word/2010/wordprocessingDrawing" xmlns:wp="http://schemas.openxmlformats.org/drawingml/2006/wordprocessingDrawing" xmlns:w10="urn:schemas-microsoft-com:office:word" xmlns:w="http://schemas.openxmlformats.org/wordprocessingml/2006/main" xmlns:w14="http://schemas.microsoft.com/office/word/2010/wordml" xmlns:w15="http://schemas.microsoft.com/office/word/2012/wordml" xmlns:w16cex="http://schemas.microsoft.com/office/word/2018/wordml/cex" xmlns:w16cid="http://schemas.microsoft.com/office/word/2016/wordml/cid" xmlns:w16="http://schemas.microsoft.com/office/word/2018/wordml" xmlns:w16du="http://schemas.microsoft.com/office/word/2023/wordml/word16du" xmlns:w16sdtdh="http://schemas.microsoft.com/office/word/2020/wordml/sdtdatahash" xmlns:w16sdtfl="http://schemas.microsoft.com/office/word/2024/wordml/sdtformatlock" xmlns:w16se="http://schemas.microsoft.com/office/word/2015/wordml/symex" xmlns:wpg="http://schemas.microsoft.com/office/word/2010/wordprocessingGroup" xmlns:wpi="http://schemas.microsoft.com/office/word/2010/wordprocessingInk" xmlns:wne="http://schemas.microsoft.com/office/word/2006/wordml" xmlns:wps="http://schemas.microsoft.com/office/word/2010/wordprocessingShape" mc:Ignorable="w14 w15 w16se w16cid w16 w16cex w16sdtdh w16sdtfl w16du wp14">
   <w:body>
     <w:p>
       <w:pPr>
@@ -41,6 +41,8 @@
       </w:pPr>
       <w:r>
         <w:rPr>
+          <w:b/>
+          <w:bCs/>
           <w:sz w:val="16"/>
         </w:rPr>
         <w:t>403-346-</w:t>
@@ -48,9 +50,17 @@
       <w:proofErr w:type="gramStart"/>
       <w:r>
         <w:rPr>
+          <w:b/>
+          <w:bCs/>
           <w:sz w:val="16"/>
         </w:rPr>
-        <w:t>0034  |</w:t>
+        <w:t>0034</w:t>
+      </w:r>
+      <w:r>
+        <w:rPr>
+          <w:sz w:val="16"/>
+        </w:rPr>
+        <w:t xml:space="preserve">  |</w:t>
       </w:r>
       <w:proofErr w:type="gramEnd"/>
       <w:r>
@@ -73,26 +83,14 @@
         <w:rPr>
           <w:sz w:val="15"/>
         </w:rPr>
-        <w:t xml:space="preserve">PO Box 33046 </w:t>
-      </w:r>
+        <w:t xml:space="preserve">PO Box 33046 Red Deer </w:t>
+      </w:r>
+      <w:proofErr w:type="gramStart"/>
       <w:r>
         <w:rPr>
           <w:sz w:val="15"/>
         </w:rPr>
-        <w:t xml:space="preserve">Red Deer </w:t>
-      </w:r>
-      <w:proofErr w:type="gramStart"/>
-      <w:r>
-        <w:rPr>
-          <w:sz w:val="15"/>
-        </w:rPr>
-        <w:t xml:space="preserve">AB, </w:t>
-      </w:r>
-      <w:r>
-        <w:rPr>
-          <w:sz w:val="15"/>
-        </w:rPr>
-        <w:t xml:space="preserve"> T</w:t>
+        <w:t>AB,  T</w:t>
       </w:r>
       <w:proofErr w:type="gramEnd"/>
       <w:r>
@@ -114,20 +112,13 @@
         </w:rPr>
         <w:t>G.S.T.#: 861 556 827</w:t>
       </w:r>
-      <w:r>
-        <w:rPr>
-          <w:rFonts w:ascii="Calibri" w:eastAsia="Calibri" w:hAnsi="Calibri" w:cs="Calibri"/>
-          <w:noProof/>
-          <w:sz w:val="22"/>
-        </w:rPr>
-      </w:r>
     </w:p>
     <w:p>
       <w:pPr>
         <w:tabs>
           <w:tab w:val="center" w:pos="4826"/>
         </w:tabs>
-        <w:spacing w:after="0" w:line="360" w:lineRule="auto"/>
+        <w:spacing w:before="240" w:after="0" w:line="360" w:lineRule="auto"/>
         <w:ind w:left="0"/>
         <w:jc w:val="both"/>
       </w:pPr>
@@ -135,12 +126,7 @@
         <w:rPr>
           <w:sz w:val="19"/>
         </w:rPr>
-        <w:t>Dear: {{client_name}}     Your Reservation Number is  {{reservation_number}} (Please quote this number when calling us.)</w:t>
-      </w:r>
-      <w:r>
-        <w:rPr>
-          <w:sz w:val="19"/>
-        </w:rPr>
+        <w:t xml:space="preserve">Dear: </w:t>
       </w:r>
       <w:r>
         <w:rPr>
@@ -149,7 +135,9 @@
           <w:sz w:val="20"/>
           <w:szCs w:val="28"/>
         </w:rPr>
-      </w:r>
+        <w:t>{{client_name</w:t>
+      </w:r>
+      <w:proofErr w:type="gramStart"/>
       <w:r>
         <w:rPr>
           <w:b/>
@@ -157,52 +145,62 @@
           <w:sz w:val="20"/>
           <w:szCs w:val="28"/>
         </w:rPr>
-      </w:r>
-      <w:r>
-        <w:rPr>
-          <w:sz w:val="19"/>
-        </w:rPr>
+        <w:t xml:space="preserve">}}   </w:t>
+      </w:r>
+      <w:proofErr w:type="gramEnd"/>
+      <w:r>
+        <w:rPr>
+          <w:b/>
+          <w:bCs/>
+          <w:sz w:val="20"/>
+          <w:szCs w:val="28"/>
+        </w:rPr>
+        <w:t xml:space="preserve">  </w:t>
+      </w:r>
+      <w:r>
+        <w:rPr>
+          <w:sz w:val="19"/>
+        </w:rPr>
+        <w:t xml:space="preserve">Your Reservation Number </w:t>
       </w:r>
       <w:proofErr w:type="gramStart"/>
       <w:r>
         <w:rPr>
           <w:sz w:val="19"/>
         </w:rPr>
+        <w:t xml:space="preserve">is  </w:t>
+      </w:r>
+      <w:r>
+        <w:rPr>
+          <w:b/>
+          <w:bCs/>
+          <w:sz w:val="19"/>
+        </w:rPr>
+        <w:t>{</w:t>
       </w:r>
       <w:proofErr w:type="gramEnd"/>
       <w:r>
         <w:rPr>
-          <w:sz w:val="19"/>
-        </w:rPr>
-      </w:r>
-      <w:r>
-        <w:rPr>
           <w:b/>
-          <w:sz w:val="19"/>
-        </w:rPr>
-      </w:r>
-      <w:r>
-        <w:rPr>
-          <w:b/>
-          <w:sz w:val="19"/>
-        </w:rPr>
-      </w:r>
-      <w:r>
-        <w:rPr>
-          <w:b/>
-          <w:sz w:val="19"/>
-        </w:rPr>
-      </w:r>
-      <w:r>
-        <w:rPr>
           <w:bCs/>
           <w:sz w:val="19"/>
         </w:rPr>
+        <w:t>{reservation_number}}</w:t>
+      </w:r>
+      <w:r>
+        <w:rPr>
+          <w:sz w:val="19"/>
+        </w:rPr>
+        <w:t xml:space="preserve"> (</w:t>
       </w:r>
       <w:r>
         <w:rPr>
           <w:i/>
-        </w:rPr>
+          <w:iCs/>
+          <w:sz w:val="16"/>
+          <w:szCs w:val="20"/>
+        </w:rPr>
+        <w:t>Please quote this number when calling us.)</w:t>
       </w:r>
     </w:p>
     <w:p>
@@ -240,104 +238,62 @@
         <w:rPr>
           <w:sz w:val="19"/>
         </w:rPr>
-        <w:t>Date for the Reservation: {{charter_date}}</w:t>
+        <w:t>Date for the Reservation: {{</w:t>
+      </w:r>
+      <w:proofErr w:type="spellStart"/>
+      <w:r>
+        <w:rPr>
+          <w:sz w:val="19"/>
+        </w:rPr>
+        <w:t>charter_date</w:t>
+      </w:r>
+      <w:proofErr w:type="spellEnd"/>
+      <w:r>
+        <w:rPr>
+          <w:sz w:val="19"/>
+        </w:rPr>
+        <w:t>}}</w:t>
+      </w:r>
+      <w:r>
+        <w:rPr>
+          <w:sz w:val="19"/>
+        </w:rPr>
         <w:tab/>
-        <w:t xml:space="preserve">    Arrival Time: {{pickup_time}}    Predicted End Time: {{dropoff_time}} </w:t>
-      </w:r>
-      <w:r>
-        <w:rPr>
-          <w:sz w:val="19"/>
-        </w:rPr>
-      </w:r>
-      <w:r>
-        <w:rPr>
-          <w:b/>
-          <w:sz w:val="19"/>
-        </w:rPr>
-      </w:r>
-      <w:r>
-        <w:rPr>
-          <w:b/>
-          <w:sz w:val="19"/>
-        </w:rPr>
-      </w:r>
-      <w:r>
-        <w:rPr>
-          <w:b/>
-          <w:sz w:val="19"/>
-        </w:rPr>
-      </w:r>
-      <w:r>
-        <w:rPr>
-          <w:sz w:val="19"/>
-        </w:rPr>
-      </w:r>
-      <w:r>
-        <w:rPr>
-          <w:sz w:val="19"/>
-        </w:rPr>
-      </w:r>
-      <w:r>
-        <w:rPr>
-          <w:sz w:val="19"/>
-        </w:rPr>
-      </w:r>
-      <w:r>
-        <w:rPr>
-          <w:b/>
-          <w:sz w:val="19"/>
-        </w:rPr>
+        <w:t xml:space="preserve">    </w:t>
+      </w:r>
+      <w:r>
+        <w:rPr>
+          <w:sz w:val="19"/>
+        </w:rPr>
+        <w:t>Start</w:t>
+      </w:r>
+      <w:r>
+        <w:rPr>
+          <w:sz w:val="19"/>
+        </w:rPr>
+        <w:t xml:space="preserve"> Time: {{</w:t>
       </w:r>
       <w:proofErr w:type="spellStart"/>
       <w:r>
         <w:rPr>
-          <w:b/>
-          <w:sz w:val="19"/>
-        </w:rPr>
+          <w:sz w:val="19"/>
+        </w:rPr>
+        <w:t>pickup_time</w:t>
       </w:r>
       <w:proofErr w:type="spellEnd"/>
-      <w:r>
-        <w:rPr>
-          <w:b/>
-          <w:sz w:val="19"/>
-        </w:rPr>
-      </w:r>
-      <w:r>
-        <w:rPr>
-          <w:sz w:val="19"/>
-        </w:rPr>
-      </w:r>
-      <w:r>
-        <w:rPr>
-          <w:sz w:val="19"/>
-        </w:rPr>
-      </w:r>
-      <w:r>
-        <w:rPr>
-          <w:sz w:val="19"/>
-        </w:rPr>
-      </w:r>
-      <w:r>
-        <w:rPr>
-          <w:sz w:val="19"/>
-        </w:rPr>
-      </w:r>
-      <w:r>
-        <w:rPr>
-          <w:sz w:val="19"/>
-        </w:rPr>
-      </w:r>
-      <w:r>
-        <w:rPr>
-          <w:b/>
-          <w:sz w:val="19"/>
-        </w:rPr>
-      </w:r>
-      <w:r>
-        <w:rPr>
-          <w:b/>
-          <w:sz w:val="19"/>
-        </w:rPr>
+      <w:proofErr w:type="gramStart"/>
+      <w:r>
+        <w:rPr>
+          <w:sz w:val="19"/>
+        </w:rPr>
+        <w:t xml:space="preserve">}}   </w:t>
+      </w:r>
+      <w:proofErr w:type="gramEnd"/>
+      <w:r>
+        <w:rPr>
+          <w:sz w:val="19"/>
+        </w:rPr>
+        <w:t xml:space="preserve"> Predicted End Time: {{dropoff_time}} </w:t>
       </w:r>
     </w:p>
     <w:p>
@@ -354,23 +310,6 @@
         </w:rPr>
         <w:t>Type of Vehicle:  {{vehicle_type}}</w:t>
       </w:r>
-      <w:r>
-        <w:rPr>
-          <w:sz w:val="19"/>
-        </w:rPr>
-      </w:r>
-      <w:r>
-        <w:rPr>
-          <w:b/>
-          <w:sz w:val="19"/>
-        </w:rPr>
-      </w:r>
-      <w:r>
-        <w:rPr>
-          <w:b/>
-          <w:sz w:val="19"/>
-        </w:rPr>
-      </w:r>
     </w:p>
     <w:p>
       <w:pPr>
@@ -396,14 +335,14 @@
           <w:b/>
           <w:sz w:val="19"/>
         </w:rPr>
+        <w:t xml:space="preserve">Basic </w:t>
+      </w:r>
+      <w:r>
+        <w:rPr>
+          <w:b/>
+          <w:sz w:val="19"/>
+        </w:rPr>
         <w:t>Itinerary:</w:t>
-      </w:r>
-      <w:r>
-        <w:rPr>
-          <w:b/>
-          <w:sz w:val="19"/>
-        </w:rPr>
-        <w:t xml:space="preserve"> </w:t>
       </w:r>
     </w:p>
     <w:p>
@@ -451,8 +390,6 @@
         <w:tblInd w:w="0" w:type="dxa"/>
         <w:tblCellMar>
           <w:top w:w="71" w:type="dxa"/>
-          <w:left w:w="0" w:type="dxa"/>
-          <w:bottom w:w="0" w:type="dxa"/>
           <w:right w:w="80" w:type="dxa"/>
         </w:tblCellMar>
         <w:tblLook w:val="04A0" w:firstRow="1" w:lastRow="0" w:firstColumn="1" w:lastColumn="0" w:noHBand="0" w:noVBand="1"/>
@@ -537,57 +474,42 @@
       <w:tr>
         <w:tc>
           <w:tcPr>
-            <w:tcW w:type="dxa" w:w="5615"/>
+            <w:tcW w:w="5615" w:type="dxa"/>
           </w:tcPr>
-          <w:p>
-            <w:r>
-              <w:t>The confirmation generator fills this section from the saved charter charges, gratuity, GST, beverages, deposits, and balance.</w:t>
-            </w:r>
-          </w:p>
+          <w:p/>
         </w:tc>
         <w:tc>
           <w:tcPr>
-            <w:tcW w:type="dxa" w:w="1224"/>
+            <w:tcW w:w="1224" w:type="dxa"/>
           </w:tcPr>
-          <w:p>
-            <w:r/>
-          </w:p>
+          <w:p/>
         </w:tc>
         <w:tc>
           <w:tcPr>
-            <w:tcW w:type="dxa" w:w="1378"/>
+            <w:tcW w:w="1378" w:type="dxa"/>
           </w:tcPr>
-          <w:p>
-            <w:r/>
-          </w:p>
+          <w:p/>
         </w:tc>
         <w:tc>
           <w:tcPr>
-            <w:tcW w:type="dxa" w:w="270"/>
+            <w:tcW w:w="270" w:type="dxa"/>
           </w:tcPr>
-          <w:p>
-            <w:r/>
-          </w:p>
+          <w:p/>
         </w:tc>
         <w:tc>
           <w:tcPr>
-            <w:tcW w:type="dxa" w:w="1573"/>
+            <w:tcW w:w="1573" w:type="dxa"/>
           </w:tcPr>
-          <w:p>
-            <w:r/>
-          </w:p>
+          <w:p/>
         </w:tc>
       </w:tr>
     </w:tbl>
     <w:p>
       <w:pPr>
-        <w:spacing w:after="98" w:line="257" w:lineRule="auto"/>
-        <w:ind w:left="-5"/>
-      </w:pPr>
-    </w:p>
-    <w:p>
-      <w:pPr>
         <w:pStyle w:val="Heading1"/>
+        <w:tabs>
+          <w:tab w:val="left" w:pos="284"/>
+        </w:tabs>
         <w:spacing w:line="240" w:lineRule="auto"/>
         <w:ind w:left="-5"/>
       </w:pPr>
@@ -599,269 +521,213 @@
       <w:pPr>
         <w:pStyle w:val="Heading2"/>
         <w:tabs>
+          <w:tab w:val="left" w:pos="284"/>
           <w:tab w:val="center" w:pos="1006"/>
+        </w:tabs>
+        <w:spacing w:line="240" w:lineRule="auto"/>
+        <w:ind w:left="0" w:firstLine="0"/>
+      </w:pPr>
+      <w:r>
+        <w:t>Client Verification</w:t>
+      </w:r>
+    </w:p>
+    <w:p>
+      <w:pPr>
+        <w:tabs>
+          <w:tab w:val="left" w:pos="284"/>
+        </w:tabs>
+        <w:spacing w:after="110" w:line="240" w:lineRule="auto"/>
+        <w:ind w:left="279"/>
+      </w:pPr>
+      <w:r>
+        <w:t xml:space="preserve">As you the Client, meaning the individual or entity making the reservation and financially responsible for the charter, confirm that the rental date, anticipated times, number of passengers, routing details, and billing information provided are accurate. </w:t>
+      </w:r>
+      <w:r>
+        <w:t>If no changes are communicated, services will proceed as booked, and regular fees will apply</w:t>
+      </w:r>
+    </w:p>
+    <w:p>
+      <w:pPr>
+        <w:tabs>
+          <w:tab w:val="left" w:pos="284"/>
+        </w:tabs>
+        <w:spacing w:after="110" w:line="240" w:lineRule="auto"/>
+        <w:ind w:left="279"/>
+      </w:pPr>
+      <w:r>
+        <w:t>M</w:t>
+      </w:r>
+      <w:r>
+        <w:t xml:space="preserve">ost private charters are fluid in nature; Arrow Limousine will always do its best to follow the directions </w:t>
+      </w:r>
+      <w:r>
+        <w:t xml:space="preserve">and times </w:t>
+      </w:r>
+      <w:r>
+        <w:t xml:space="preserve">provided. </w:t>
+      </w:r>
+      <w:r>
+        <w:t xml:space="preserve">In order to achieve </w:t>
+      </w:r>
+      <w:r>
+        <w:t>the best possible service,</w:t>
+      </w:r>
+      <w:r>
+        <w:t xml:space="preserve"> we request major changes be confirmed </w:t>
+      </w:r>
+      <w:r>
+        <w:t>24-hour</w:t>
+      </w:r>
+      <w:r>
+        <w:t xml:space="preserve"> prior, although once on site and you need to change your routing or extend your booking times, at the rate quoted, you can talk to the chauffeur directly and we will considered the charter amended for your convenience. </w:t>
+      </w:r>
+    </w:p>
+    <w:p>
+      <w:pPr>
+        <w:tabs>
+          <w:tab w:val="left" w:pos="284"/>
+        </w:tabs>
+        <w:spacing w:after="110" w:line="240" w:lineRule="auto"/>
+        <w:ind w:left="279"/>
+      </w:pPr>
+      <w:r>
+        <w:t xml:space="preserve">Please be aware that travel times vary depending on conditions and vehicle type, loading and unloading times take time so please do not rely on Google Maps times. If you are unsure about anything, please ask us. If changes to timing or routing are needed during the trip, please speak directly with the chauffeur. We can always update the contract afterward, provided you approve the change.  </w:t>
+      </w:r>
+    </w:p>
+    <w:p>
+      <w:pPr>
+        <w:pStyle w:val="Heading2"/>
+        <w:tabs>
+          <w:tab w:val="left" w:pos="284"/>
+          <w:tab w:val="center" w:pos="2092"/>
         </w:tabs>
         <w:spacing w:line="240" w:lineRule="auto"/>
         <w:ind w:left="-15" w:firstLine="0"/>
       </w:pPr>
       <w:r>
-        <w:t>1.</w:t>
-      </w:r>
-      <w:r>
-        <w:tab/>
-        <w:t>Client Verification</w:t>
-      </w:r>
-    </w:p>
-    <w:p>
-      <w:pPr>
+        <w:t>Reservation Authorization &amp; No-Show Policy</w:t>
+      </w:r>
+    </w:p>
+    <w:p>
+      <w:pPr>
+        <w:tabs>
+          <w:tab w:val="left" w:pos="284"/>
+        </w:tabs>
+        <w:spacing w:line="240" w:lineRule="auto"/>
+        <w:ind w:left="279"/>
+      </w:pPr>
+      <w:r>
+        <w:t>By placing a reservation and securing it with a Non-Refundable Retainer (NRR), the Client acknowledges and agrees to all policies, terms, and conditions contained herein.</w:t>
+      </w:r>
+    </w:p>
+    <w:p>
+      <w:pPr>
+        <w:tabs>
+          <w:tab w:val="left" w:pos="284"/>
+        </w:tabs>
         <w:spacing w:after="110" w:line="240" w:lineRule="auto"/>
         <w:ind w:left="279"/>
       </w:pPr>
       <w:r>
-        <w:t xml:space="preserve">As you the Client, meaning the individual or entity making the reservation and financially responsible for the charter, confirm that the rental date, anticipated times, number of passengers, routing details, and billing information provided are accurate. </w:t>
-      </w:r>
-      <w:r>
-        <w:t>If no changes are communicated, services will proceed as booked, and regular fees will apply</w:t>
-      </w:r>
-    </w:p>
-    <w:p>
-      <w:pPr>
+        <w:t>The Client expressly authorizes Arrow Limousine to charge the credit card on file for all charges relating to the reservation, including partial or full charges, and including full charter charges if the Client is deemed a no-show.</w:t>
+      </w:r>
+    </w:p>
+    <w:p>
+      <w:pPr>
+        <w:pStyle w:val="Heading2"/>
+        <w:tabs>
+          <w:tab w:val="left" w:pos="284"/>
+          <w:tab w:val="center" w:pos="1568"/>
+        </w:tabs>
+        <w:spacing w:line="240" w:lineRule="auto"/>
+        <w:ind w:left="360" w:firstLine="0"/>
+      </w:pPr>
+      <w:r>
+        <w:tab/>
+        <w:t>Non-Refundable Retainer (NRR)</w:t>
+      </w:r>
+    </w:p>
+    <w:p>
+      <w:pPr>
+        <w:tabs>
+          <w:tab w:val="left" w:pos="284"/>
+        </w:tabs>
         <w:spacing w:after="110" w:line="240" w:lineRule="auto"/>
-        <w:ind w:left="279"/>
-      </w:pPr>
-      <w:r>
-        <w:t>M</w:t>
-      </w:r>
-      <w:r>
-        <w:t xml:space="preserve">ost private charters are fluid in </w:t>
-      </w:r>
-      <w:r>
-        <w:t>nature;</w:t>
-      </w:r>
-      <w:r>
-        <w:t xml:space="preserve"> Arrow Limousine will always do its best to follow the directions </w:t>
-      </w:r>
-      <w:r>
-        <w:t xml:space="preserve">and times </w:t>
-      </w:r>
-      <w:r>
-        <w:t xml:space="preserve">provided. </w:t>
-      </w:r>
-      <w:r>
-        <w:t xml:space="preserve">In order to achieve </w:t>
-      </w:r>
-      <w:r>
-        <w:t xml:space="preserve">the best possible </w:t>
-      </w:r>
-      <w:r>
-        <w:t>service,</w:t>
-      </w:r>
-      <w:r>
-        <w:t xml:space="preserve"> we request major changes be confirmed </w:t>
-      </w:r>
-      <w:r>
-        <w:t>24-hour</w:t>
-      </w:r>
-      <w:r>
-        <w:t xml:space="preserve"> prior, although once on site and you need to change your routing or extend your booking times, at the rate quoted, you can talk to the chauffeur directly and we </w:t>
-      </w:r>
-      <w:r>
-        <w:t xml:space="preserve">will considered </w:t>
-      </w:r>
-      <w:r>
-        <w:t xml:space="preserve">the charter </w:t>
-      </w:r>
-      <w:r>
-        <w:t>amended for your convenience</w:t>
-      </w:r>
-      <w:r>
-        <w:t xml:space="preserve">. </w:t>
-      </w:r>
-    </w:p>
-    <w:p>
-      <w:pPr>
-        <w:spacing w:after="110" w:line="240" w:lineRule="auto"/>
-        <w:ind w:left="279"/>
-      </w:pPr>
-      <w:r>
-        <w:t>Please be aware that</w:t>
-      </w:r>
-      <w:r>
-        <w:t xml:space="preserve"> travel times vary depending on conditions</w:t>
-      </w:r>
-      <w:r>
-        <w:t xml:space="preserve"> and vehicle type, loading and unloading times take time so p</w:t>
-      </w:r>
-      <w:r>
-        <w:t xml:space="preserve">lease do not rely on Google Maps times. If you are unsure about anything, please ask us. If changes to timing or routing are needed during the trip, please speak directly with the chauffeur. We can always update the </w:t>
-      </w:r>
-      <w:r>
-        <w:t>contract</w:t>
-      </w:r>
-      <w:r>
-        <w:t xml:space="preserve"> afterward, provided you approve the change</w:t>
-      </w:r>
-      <w:r>
-        <w:t xml:space="preserve">.  </w:t>
+        <w:ind w:left="360" w:firstLine="0"/>
+      </w:pPr>
+      <w:r>
+        <w:t>A Non-Refundable Retainer (NRR) is a fee paid in advance to secure charter services and is non-refundable under all circumstances. An NRR is required to confirm and secure a charter booking. Once the retainer clears, the charter is confirmed for the specified date and time, and Arrow Limousine immediately turns away other inquiries for that vehicle and date. Charter bookings of five (5) hours or more typically require an NRR equal to fifty percent (50%) of the total charter charge.</w:t>
       </w:r>
     </w:p>
     <w:p>
       <w:pPr>
         <w:pStyle w:val="Heading2"/>
         <w:tabs>
-          <w:tab w:val="center" w:pos="2092"/>
+          <w:tab w:val="left" w:pos="284"/>
+          <w:tab w:val="center" w:pos="1375"/>
         </w:tabs>
         <w:spacing w:line="240" w:lineRule="auto"/>
         <w:ind w:left="-15" w:firstLine="0"/>
       </w:pPr>
       <w:r>
-        <w:t>2.</w:t>
-      </w:r>
-      <w:r>
-        <w:tab/>
-        <w:t>Reservation Authorization &amp; No-Show Policy</w:t>
-      </w:r>
-    </w:p>
-    <w:p>
-      <w:pPr>
+        <w:t>Payments, Fees &amp; Charges</w:t>
+      </w:r>
+    </w:p>
+    <w:p>
+      <w:pPr>
+        <w:tabs>
+          <w:tab w:val="left" w:pos="284"/>
+        </w:tabs>
+        <w:spacing w:after="0" w:line="240" w:lineRule="auto"/>
+        <w:ind w:left="279"/>
+      </w:pPr>
+      <w:r>
+        <w:t>Arrow Limousine accepts Visa and MasterCard. Cash or e-Transfer may be arranged in advance</w:t>
+      </w:r>
+      <w:r>
+        <w:t>, and a</w:t>
+      </w:r>
+      <w:r>
+        <w:t>ll charges are processed in Canadian Dollars (CAD)</w:t>
+      </w:r>
+      <w:r>
+        <w:t>.</w:t>
+      </w:r>
+    </w:p>
+    <w:p>
+      <w:pPr>
+        <w:tabs>
+          <w:tab w:val="left" w:pos="284"/>
+        </w:tabs>
         <w:spacing w:line="240" w:lineRule="auto"/>
         <w:ind w:left="279"/>
       </w:pPr>
       <w:r>
-        <w:t>By placing a reservation and securing it with a Non-Refundable Retainer (NRR), the Client acknowledges and agrees to all policies, terms, and conditions contained herein.</w:t>
-      </w:r>
-    </w:p>
-    <w:p>
-      <w:pPr>
-        <w:spacing w:after="110" w:line="240" w:lineRule="auto"/>
-        <w:ind w:left="279"/>
-      </w:pPr>
-      <w:r>
-        <w:t>The Client expressly authorizes Arrow Limousine to charge the credit card on file for all charges relating to the reservation, including partial or full charges, and including full charter charges if the Client is deemed a no-show.</w:t>
-      </w:r>
-    </w:p>
-    <w:p>
-      <w:pPr>
-        <w:pStyle w:val="Heading2"/>
-        <w:tabs>
-          <w:tab w:val="center" w:pos="1568"/>
-        </w:tabs>
-        <w:spacing w:line="240" w:lineRule="auto"/>
-        <w:ind w:left="360" w:firstLine="0"/>
-      </w:pPr>
-      <w:r>
-        <w:tab/>
-        <w:t>Non-Refundable Retainer (NRR)</w:t>
-      </w:r>
-    </w:p>
-    <w:p>
-      <w:pPr>
-        <w:spacing w:after="110" w:line="240" w:lineRule="auto"/>
-        <w:ind w:left="360" w:firstLine="0"/>
-      </w:pPr>
-      <w:r>
-        <w:t>A Non-Refundable Retainer (NRR) is a fee paid in advance to secure charter services and is non-refundable under all circumstances. An NRR is required to confirm and secure a charter booking. Once the retainer clears, the charter is confirmed for the specified date and time, and Arrow Limousine immediately turns away other inquiries for that vehicle and date. Charter bookings of five (5) hours or more typically require an NRR equal to fifty percent (50%) of the total charter charge.</w:t>
-      </w:r>
-    </w:p>
-    <w:p>
-      <w:pPr>
-        <w:pStyle w:val="Heading2"/>
-        <w:tabs>
-          <w:tab w:val="center" w:pos="1375"/>
-        </w:tabs>
-        <w:spacing w:line="240" w:lineRule="auto"/>
-        <w:ind w:left="-15" w:firstLine="0"/>
-      </w:pPr>
-      <w:r>
-        <w:t>4.</w:t>
-      </w:r>
-      <w:r>
-        <w:tab/>
-        <w:t>Payments, Fees &amp; Charges</w:t>
-      </w:r>
-    </w:p>
-    <w:p>
-      <w:pPr>
-        <w:spacing w:after="0" w:line="240" w:lineRule="auto"/>
-        <w:ind w:left="279"/>
-      </w:pPr>
-      <w:r>
-        <w:t>Arrow Limousine accepts Visa and MasterCard. Cash or e-Transfer may be arranged in advance</w:t>
-      </w:r>
-      <w:r>
-        <w:t>, and a</w:t>
-      </w:r>
-      <w:r>
-        <w:t>ll charges are processed in Canadian Dollars (CAD)</w:t>
-      </w:r>
-      <w:r>
-        <w:t>.</w:t>
-      </w:r>
-    </w:p>
-    <w:p>
-      <w:pPr>
-        <w:spacing w:line="240" w:lineRule="auto"/>
-        <w:ind w:left="279"/>
-      </w:pPr>
-      <w:r>
-        <w:t>Invoiced gratuity</w:t>
+        <w:t>Invoiced gratuity is listed as a controlled tip and is subject to GST, as required by CRA</w:t>
+      </w:r>
+      <w:r>
+        <w:t xml:space="preserve">. </w:t>
+      </w:r>
+      <w:r>
+        <w:t xml:space="preserve">Beverage orders, parking fees, tolls, event entrance fees, or other charter-related expenses will be billed at </w:t>
+      </w:r>
+      <w:r>
+        <w:t xml:space="preserve">pricing reflecting normal retail </w:t>
+      </w:r>
+      <w:r>
+        <w:t>b</w:t>
+      </w:r>
+      <w:r>
+        <w:t>usiness margins</w:t>
+      </w:r>
+      <w:r>
+        <w:t xml:space="preserve"> and charged to your card or account unless alternate arrangements are approved in advance and noted on the booking, while unopened non-alcoholic beverages and your own snacks or non-allergenic food are welcome on board.</w:t>
       </w:r>
       <w:r>
         <w:t xml:space="preserve"> </w:t>
       </w:r>
       <w:r>
-        <w:t>is</w:t>
-      </w:r>
-      <w:r>
-        <w:t xml:space="preserve"> listed</w:t>
-      </w:r>
-      <w:r>
-        <w:t xml:space="preserve"> as a controlled tip and</w:t>
-      </w:r>
-      <w:r>
-        <w:t xml:space="preserve"> is subject to GST, as required by CRA</w:t>
-      </w:r>
-      <w:r>
-        <w:t xml:space="preserve">. </w:t>
-      </w:r>
-      <w:r>
-        <w:t xml:space="preserve">Beverage orders, parking fees, tolls, event entrance fees, or other charter-related expenses will be billed at </w:t>
-      </w:r>
-      <w:r>
-        <w:t>pricing reflect</w:t>
-      </w:r>
-      <w:r>
-        <w:t>ing</w:t>
-      </w:r>
-      <w:r>
-        <w:t xml:space="preserve"> normal retail </w:t>
-      </w:r>
-      <w:r>
-        <w:t>b</w:t>
-      </w:r>
-      <w:r>
-        <w:t>usiness margins</w:t>
-      </w:r>
-      <w:r>
-        <w:t xml:space="preserve"> </w:t>
-      </w:r>
-      <w:r>
-        <w:t>and charged to your</w:t>
-      </w:r>
-      <w:r>
-        <w:t xml:space="preserve"> </w:t>
-      </w:r>
-      <w:r>
-        <w:t>card or account unless alternate arrangements are approved in advance and noted on the booking, while unopened non-alcoholic beverages and your own snacks or non-allergenic food are welcome on board.</w:t>
-      </w:r>
-      <w:r>
-        <w:t xml:space="preserve"> </w:t>
-      </w:r>
-      <w:r>
-        <w:t xml:space="preserve">The NRR is processed immediately upon booking. Any remaining balance </w:t>
-      </w:r>
-      <w:r>
-        <w:t xml:space="preserve">is due within seven (7) days of the service date. If the charter exceeds the scheduled time, additional hourly charges at the </w:t>
+        <w:t xml:space="preserve">The NRR is processed immediately upon booking. Any remaining balance is due within seven (7) days of the service date. If the charter exceeds the scheduled time, additional hourly charges at the </w:t>
       </w:r>
       <w:r>
         <w:t xml:space="preserve">quoted or hourly </w:t>
@@ -872,6 +738,9 @@
     </w:p>
     <w:p>
       <w:pPr>
+        <w:tabs>
+          <w:tab w:val="left" w:pos="284"/>
+        </w:tabs>
         <w:spacing w:line="240" w:lineRule="auto"/>
         <w:ind w:left="279"/>
         <w:jc w:val="both"/>
@@ -888,6 +757,9 @@
     </w:p>
     <w:p>
       <w:pPr>
+        <w:tabs>
+          <w:tab w:val="left" w:pos="284"/>
+        </w:tabs>
         <w:spacing w:line="240" w:lineRule="auto"/>
         <w:ind w:left="279"/>
         <w:jc w:val="both"/>
@@ -900,6 +772,7 @@
       <w:pPr>
         <w:pStyle w:val="Heading2"/>
         <w:tabs>
+          <w:tab w:val="left" w:pos="284"/>
           <w:tab w:val="center" w:pos="1162"/>
         </w:tabs>
         <w:spacing w:line="240" w:lineRule="auto"/>
@@ -910,21 +783,21 @@
       <w:pPr>
         <w:pStyle w:val="Heading2"/>
         <w:tabs>
+          <w:tab w:val="left" w:pos="284"/>
           <w:tab w:val="center" w:pos="1970"/>
         </w:tabs>
         <w:spacing w:line="240" w:lineRule="auto"/>
         <w:ind w:left="-15" w:firstLine="0"/>
       </w:pPr>
       <w:r>
-        <w:t>7.</w:t>
-      </w:r>
-      <w:r>
-        <w:tab/>
         <w:t>Damage, Cleaning &amp; Client Responsibility</w:t>
       </w:r>
     </w:p>
     <w:p>
       <w:pPr>
+        <w:tabs>
+          <w:tab w:val="left" w:pos="284"/>
+        </w:tabs>
         <w:spacing w:line="240" w:lineRule="auto"/>
         <w:ind w:left="279"/>
       </w:pPr>
@@ -934,207 +807,173 @@
     </w:p>
     <w:p>
       <w:pPr>
+        <w:tabs>
+          <w:tab w:val="left" w:pos="284"/>
+        </w:tabs>
         <w:spacing w:after="110" w:line="240" w:lineRule="auto"/>
         <w:ind w:left="709" w:firstLine="0"/>
       </w:pPr>
       <w:r>
-        <w:t>• Vomit, sickness, or bodily fluids: $250 minimum (hazmat</w:t>
-      </w:r>
-      <w:r>
-        <w:t xml:space="preserve"> </w:t>
-      </w:r>
-      <w:r>
-        <w:t>sanitization required)</w:t>
-      </w:r>
-      <w:r>
-        <w:t>.</w:t>
-      </w:r>
-    </w:p>
-    <w:p>
-      <w:pPr>
+        <w:t>• Vomit, sickness, or bodily fluids: $250 minimum (hazmat sanitization required).</w:t>
+      </w:r>
+    </w:p>
+    <w:p>
+      <w:pPr>
+        <w:tabs>
+          <w:tab w:val="left" w:pos="284"/>
+        </w:tabs>
         <w:spacing w:after="110" w:line="240" w:lineRule="auto"/>
         <w:ind w:left="709" w:firstLine="0"/>
       </w:pPr>
       <w:r>
-        <w:t>• Alcohol spillage: Cleaning fee based on severity</w:t>
-      </w:r>
-      <w:r>
-        <w:t>.</w:t>
-      </w:r>
-    </w:p>
-    <w:p>
-      <w:pPr>
+        <w:t>• Alcohol spillage: Cleaning fee based on severity.</w:t>
+      </w:r>
+      <w:r>
+        <w:t xml:space="preserve"> </w:t>
+      </w:r>
+      <w:r>
+        <w:t>• Broken glassware: $10 per glass.</w:t>
+      </w:r>
+      <w:r>
+        <w:t xml:space="preserve"> </w:t>
+      </w:r>
+      <w:r>
+        <w:t>• Smoking or vaping violations: $100 per violation.</w:t>
+      </w:r>
+      <w:r>
+        <w:t xml:space="preserve"> </w:t>
+      </w:r>
+      <w:r>
+        <w:t>• Upholstery tears or damage to stereo, television, lighting, or vehicle components: $500–$1,000.</w:t>
+      </w:r>
+      <w:r>
+        <w:t xml:space="preserve"> </w:t>
+      </w:r>
+      <w:r>
+        <w:t xml:space="preserve">• Opening a vehicle door into another vehicle or </w:t>
+      </w:r>
+      <w:r>
+        <w:t>objects: $</w:t>
+      </w:r>
+      <w:r>
+        <w:t>1,500–$2,000.</w:t>
+      </w:r>
+      <w:r>
+        <w:t xml:space="preserve"> </w:t>
+      </w:r>
+      <w:r>
+        <w:t>• Tampering with or opening emergency exits: $850.</w:t>
+      </w:r>
+      <w:r>
+        <w:t xml:space="preserve"> </w:t>
+      </w:r>
+    </w:p>
+    <w:p>
+      <w:pPr>
+        <w:tabs>
+          <w:tab w:val="left" w:pos="284"/>
+        </w:tabs>
         <w:spacing w:after="110" w:line="240" w:lineRule="auto"/>
-        <w:ind w:left="709" w:firstLine="0"/>
-      </w:pPr>
-      <w:r>
-        <w:t>• Broken glassware: $10 per glass</w:t>
-      </w:r>
-      <w:r>
-        <w:t>.</w:t>
-      </w:r>
-    </w:p>
-    <w:p>
-      <w:pPr>
-        <w:spacing w:after="110" w:line="240" w:lineRule="auto"/>
-        <w:ind w:left="709" w:firstLine="0"/>
-      </w:pPr>
-      <w:r>
-        <w:t>• Smoking or vaping violations: $100 per violation</w:t>
-      </w:r>
-      <w:r>
-        <w:t>.</w:t>
-      </w:r>
-    </w:p>
-    <w:p>
-      <w:pPr>
-        <w:spacing w:after="110" w:line="240" w:lineRule="auto"/>
-        <w:ind w:left="709" w:firstLine="0"/>
-      </w:pPr>
-      <w:r>
-        <w:t>• Upholstery tears or damage to stereo, television, lighting, or vehicle</w:t>
-      </w:r>
-      <w:r>
-        <w:t xml:space="preserve"> </w:t>
-      </w:r>
-      <w:r>
-        <w:t>components: $500–$1,000</w:t>
-      </w:r>
-      <w:r>
-        <w:t>.</w:t>
-      </w:r>
-    </w:p>
-    <w:p>
-      <w:pPr>
-        <w:spacing w:after="110" w:line="240" w:lineRule="auto"/>
-        <w:ind w:left="709" w:firstLine="0"/>
-      </w:pPr>
-      <w:r>
-        <w:t xml:space="preserve">• Opening a vehicle door into another vehicle or </w:t>
-      </w:r>
-      <w:proofErr w:type="gramStart"/>
-      <w:r>
-        <w:t>objects:</w:t>
-      </w:r>
-      <w:r>
-        <w:t>$</w:t>
-      </w:r>
-      <w:proofErr w:type="gramEnd"/>
-      <w:r>
-        <w:t>1,500–$2,000</w:t>
-      </w:r>
-      <w:r>
-        <w:t>.</w:t>
-      </w:r>
-    </w:p>
-    <w:p>
-      <w:pPr>
-        <w:spacing w:after="110" w:line="240" w:lineRule="auto"/>
-        <w:ind w:left="709" w:firstLine="0"/>
-      </w:pPr>
-      <w:r>
-        <w:t>• Tampering with or opening emergency exits: $850</w:t>
-      </w:r>
-      <w:r>
-        <w:t>.</w:t>
-      </w:r>
-    </w:p>
-    <w:p>
-      <w:pPr>
+        <w:ind w:left="284" w:firstLine="0"/>
+      </w:pPr>
+      <w:r>
+        <w:t xml:space="preserve">These fees represent </w:t>
+      </w:r>
+      <w:r>
+        <w:t xml:space="preserve">some </w:t>
+      </w:r>
+      <w:r>
+        <w:t>minimum charges based on prior charters. All assessed charges will be billed to the credit card on file within two (2) business days, unless alternate arrangements are approved in advance.</w:t>
+      </w:r>
+    </w:p>
+    <w:p>
+      <w:pPr>
+        <w:tabs>
+          <w:tab w:val="left" w:pos="284"/>
+          <w:tab w:val="center" w:pos="1105"/>
+        </w:tabs>
+        <w:spacing w:after="5" w:line="240" w:lineRule="auto"/>
+        <w:ind w:left="-15" w:firstLine="0"/>
+      </w:pPr>
+      <w:r>
+        <w:rPr>
+          <w:b/>
+        </w:rPr>
+        <w:lastRenderedPageBreak/>
+        <w:t>Alcohol Regulations</w:t>
+      </w:r>
+    </w:p>
+    <w:p>
+      <w:pPr>
+        <w:tabs>
+          <w:tab w:val="left" w:pos="284"/>
+        </w:tabs>
+        <w:spacing w:after="109" w:line="240" w:lineRule="auto"/>
+        <w:ind w:left="279"/>
+      </w:pPr>
+      <w:r>
+        <w:t>All applicable Alberta Gaming, Liquor and Cannabis (AGLC) rules and regulations always apply.</w:t>
+      </w:r>
+      <w:r>
+        <w:t xml:space="preserve"> Anyone under the appearance of 25 must show id to the chauffeur. </w:t>
+      </w:r>
+    </w:p>
+    <w:p>
+      <w:pPr>
+        <w:pStyle w:val="Heading2"/>
+        <w:tabs>
+          <w:tab w:val="left" w:pos="284"/>
+          <w:tab w:val="center" w:pos="1998"/>
+        </w:tabs>
+        <w:spacing w:line="240" w:lineRule="auto"/>
+        <w:ind w:left="-15" w:firstLine="0"/>
+      </w:pPr>
+      <w:r>
+        <w:t>Smoking, Vaping &amp; Restricted Substances</w:t>
+      </w:r>
+    </w:p>
+    <w:p>
+      <w:pPr>
+        <w:tabs>
+          <w:tab w:val="left" w:pos="284"/>
+        </w:tabs>
+        <w:spacing w:line="240" w:lineRule="auto"/>
+        <w:ind w:left="279"/>
+      </w:pPr>
+      <w:r>
+        <w:t>Smoking, vaping, or the use or possession of restricted, illegal, or controlled substances is strictly always prohibited in the vehicle. This includes, but is not limited to, tobacco products, electronic cigarettes (e-cigarettes), cannabis products, and any substances prohibited under provincial or federal law.</w:t>
+      </w:r>
+    </w:p>
+    <w:p>
+      <w:pPr>
+        <w:tabs>
+          <w:tab w:val="left" w:pos="284"/>
+        </w:tabs>
         <w:spacing w:after="110" w:line="240" w:lineRule="auto"/>
         <w:ind w:left="279"/>
       </w:pPr>
       <w:r>
-        <w:t xml:space="preserve">These fees represent </w:t>
-      </w:r>
-      <w:r>
-        <w:t xml:space="preserve">some </w:t>
-      </w:r>
-      <w:r>
-        <w:t>minimum charges based on prior charters. All assessed charges will be billed to the credit card on file within two (2) business days, unless alternate arrangements are approved in advance.</w:t>
-      </w:r>
-    </w:p>
-    <w:p>
-      <w:pPr>
-        <w:tabs>
-          <w:tab w:val="center" w:pos="1105"/>
-        </w:tabs>
-        <w:spacing w:after="5" w:line="240" w:lineRule="auto"/>
-        <w:ind w:left="-15" w:firstLine="0"/>
-      </w:pPr>
-      <w:r>
-        <w:rPr>
-          <w:b/>
-        </w:rPr>
-        <w:t>8.</w:t>
-      </w:r>
-      <w:r>
-        <w:rPr>
-          <w:b/>
-        </w:rPr>
-        <w:tab/>
-        <w:t>Alcohol Regulations</w:t>
-      </w:r>
-    </w:p>
-    <w:p>
-      <w:pPr>
-        <w:spacing w:after="109" w:line="240" w:lineRule="auto"/>
-        <w:ind w:left="279"/>
-      </w:pPr>
-      <w:r>
-        <w:t>All applicable Alberta Gaming, Liquor and Cannabis (AGLC) rules and regulations always apply.</w:t>
-      </w:r>
-      <w:r>
-        <w:t xml:space="preserve"> Anyone under the appearance of 25 must show id to the chauffeur. </w:t>
+        <w:t>Any violation of this policy may result in immediate termination of service without refund, and may result in cleaning, damage, or penalty charges being assessed to the Client in accordance with Section 7 of these Terms.</w:t>
       </w:r>
     </w:p>
     <w:p>
       <w:pPr>
         <w:pStyle w:val="Heading2"/>
         <w:tabs>
-          <w:tab w:val="center" w:pos="1998"/>
-        </w:tabs>
-        <w:spacing w:line="240" w:lineRule="auto"/>
-        <w:ind w:left="-15" w:firstLine="0"/>
-      </w:pPr>
-      <w:r>
-        <w:t>9.</w:t>
-      </w:r>
-      <w:r>
-        <w:tab/>
-        <w:t>Smoking, Vaping &amp; Restricted Substances</w:t>
-      </w:r>
-    </w:p>
-    <w:p>
-      <w:pPr>
-        <w:spacing w:line="240" w:lineRule="auto"/>
-        <w:ind w:left="279"/>
-      </w:pPr>
-      <w:r>
-        <w:t>Smoking, vaping, or the use or possession of restricted, illegal, or controlled substances is strictly always prohibited in the vehicle. This includes, but is not limited to, tobacco products, electronic cigarettes (e-cigarettes), cannabis products, and any substances prohibited under provincial or federal law.</w:t>
-      </w:r>
-    </w:p>
-    <w:p>
-      <w:pPr>
-        <w:spacing w:after="110" w:line="240" w:lineRule="auto"/>
-        <w:ind w:left="279"/>
-      </w:pPr>
-      <w:r>
-        <w:t>Any violation of this policy may result in immediate termination of service without refund, and may result in cleaning, damage, or penalty charges being assessed to the Client in accordance with Section 7 of these Terms.</w:t>
-      </w:r>
-    </w:p>
-    <w:p>
-      <w:pPr>
-        <w:pStyle w:val="Heading2"/>
+          <w:tab w:val="left" w:pos="284"/>
+        </w:tabs>
         <w:spacing w:line="240" w:lineRule="auto"/>
         <w:ind w:left="-5"/>
       </w:pPr>
       <w:r>
-        <w:t>10. Driver Authority &amp; Termination of Service</w:t>
-      </w:r>
-    </w:p>
-    <w:p>
-      <w:pPr>
+        <w:t>Driver Authority &amp; Termination of Service</w:t>
+      </w:r>
+    </w:p>
+    <w:p>
+      <w:pPr>
+        <w:tabs>
+          <w:tab w:val="left" w:pos="284"/>
+        </w:tabs>
         <w:spacing w:after="70" w:line="240" w:lineRule="auto"/>
         <w:ind w:left="279"/>
       </w:pPr>
@@ -1144,6 +983,9 @@
     </w:p>
     <w:p>
       <w:pPr>
+        <w:tabs>
+          <w:tab w:val="left" w:pos="284"/>
+        </w:tabs>
         <w:spacing w:after="0" w:line="240" w:lineRule="auto"/>
       </w:pPr>
       <w:r>
@@ -1182,6 +1024,9 @@
     </w:p>
     <w:p>
       <w:pPr>
+        <w:tabs>
+          <w:tab w:val="left" w:pos="284"/>
+        </w:tabs>
         <w:spacing w:line="240" w:lineRule="auto"/>
       </w:pPr>
       <w:r>
@@ -1191,18 +1036,21 @@
     <w:p>
       <w:pPr>
         <w:pStyle w:val="Heading2"/>
+        <w:tabs>
+          <w:tab w:val="left" w:pos="284"/>
+        </w:tabs>
         <w:spacing w:before="240" w:line="240" w:lineRule="auto"/>
         <w:ind w:left="-5"/>
       </w:pPr>
       <w:r>
-        <w:t xml:space="preserve">11. </w:t>
-      </w:r>
-      <w:r>
         <w:t>Uncontrollable Events &amp; Service Conditions a. Force Majeure</w:t>
       </w:r>
     </w:p>
     <w:p>
       <w:pPr>
+        <w:tabs>
+          <w:tab w:val="left" w:pos="284"/>
+        </w:tabs>
         <w:spacing w:line="240" w:lineRule="auto"/>
         <w:ind w:left="284"/>
       </w:pPr>
@@ -1213,24 +1061,21 @@
     <w:p>
       <w:pPr>
         <w:pStyle w:val="Heading2"/>
+        <w:tabs>
+          <w:tab w:val="left" w:pos="284"/>
+        </w:tabs>
         <w:spacing w:before="240" w:after="0" w:line="240" w:lineRule="auto"/>
         <w:ind w:left="-5"/>
       </w:pPr>
       <w:r>
-        <w:t>1</w:t>
-      </w:r>
-      <w:r>
-        <w:t>2</w:t>
-      </w:r>
-      <w:r>
-        <w:t xml:space="preserve">. </w:t>
-      </w:r>
-      <w:r>
         <w:t>Safe driving policy</w:t>
       </w:r>
     </w:p>
     <w:p>
       <w:pPr>
+        <w:tabs>
+          <w:tab w:val="left" w:pos="284"/>
+        </w:tabs>
         <w:spacing w:line="240" w:lineRule="auto"/>
         <w:ind w:left="284" w:right="230" w:firstLine="0"/>
         <w:rPr>
@@ -1250,24 +1095,21 @@
     <w:p>
       <w:pPr>
         <w:pStyle w:val="Heading2"/>
+        <w:tabs>
+          <w:tab w:val="left" w:pos="284"/>
+        </w:tabs>
         <w:spacing w:before="240" w:line="240" w:lineRule="auto"/>
         <w:ind w:left="-5"/>
       </w:pPr>
       <w:r>
-        <w:t>1</w:t>
-      </w:r>
-      <w:r>
-        <w:t>3</w:t>
-      </w:r>
-      <w:r>
-        <w:t xml:space="preserve">. </w:t>
-      </w:r>
-      <w:r>
         <w:t>Discounted Rate Waiver</w:t>
       </w:r>
     </w:p>
     <w:p>
       <w:pPr>
+        <w:tabs>
+          <w:tab w:val="left" w:pos="284"/>
+        </w:tabs>
         <w:spacing w:after="0" w:line="240" w:lineRule="auto"/>
         <w:ind w:left="284" w:firstLine="0"/>
       </w:pPr>
@@ -1286,6 +1128,9 @@
     </w:p>
     <w:p>
       <w:pPr>
+        <w:tabs>
+          <w:tab w:val="left" w:pos="284"/>
+        </w:tabs>
         <w:spacing w:before="240" w:after="0" w:line="240" w:lineRule="auto"/>
         <w:ind w:left="-5" w:right="270"/>
         <w:rPr>
@@ -1404,7 +1249,8 @@
       <w:footerReference w:type="default" r:id="rId9"/>
       <w:footerReference w:type="first" r:id="rId10"/>
       <w:pgSz w:w="12240" w:h="15840"/>
-      <w:pgMar w:top="156" w:right="616" w:bottom="944" w:left="851" w:header="720" w:footer="330" w:gutter="0"/>
+      <w:pgMar w:top="156" w:right="616" w:bottom="944" w:left="851" w:header="720" w:footer="141" w:gutter="0"/>
+      <w:pgNumType w:fmt="numberInDash" w:start="1"/>
       <w:cols w:space="720"/>
     </w:sectPr>
   </w:body>
@@ -1412,7 +1258,7 @@
 </file>
 
 <file path=word/endnotes.xml><?xml version="1.0" encoding="utf-8"?>
-<w:endnotes xmlns:wpc="http://schemas.microsoft.com/office/word/2010/wordprocessingCanvas" xmlns:cx="http://schemas.microsoft.com/office/drawing/2014/chartex" xmlns:cx1="http://schemas.microsoft.com/office/drawing/2015/9/8/chartex" xmlns:cx2="http://schemas.microsoft.com/office/drawing/2015/10/21/chartex" xmlns:cx3="http://schemas.microsoft.com/office/drawing/2016/5/9/chartex" xmlns:cx4="http://schemas.microsoft.com/office/drawing/2016/5/10/chartex" xmlns:cx5="http://schemas.microsoft.com/office/drawing/2016/5/11/chartex" xmlns:cx6="http://schemas.microsoft.com/office/drawing/2016/5/12/chartex" xmlns:cx7="http://schemas.microsoft.com/office/drawing/2016/5/13/chartex" xmlns:cx8="http://schemas.microsoft.com/office/drawing/2016/5/14/chartex" xmlns:mc="http://schemas.openxmlformats.org/markup-compatibility/2006" xmlns:aink="http://schemas.microsoft.com/office/drawing/2016/ink" xmlns:am3d="http://schemas.microsoft.com/office/drawing/2017/model3d" xmlns:o="urn:schemas-microsoft-com:office:office" xmlns:oel="http://schemas.microsoft.com/office/2019/extlst" xmlns:r="http://schemas.openxmlformats.org/officeDocument/2006/relationships" xmlns:m="http://schemas.openxmlformats.org/officeDocument/2006/math" xmlns:v="urn:schemas-microsoft-com:vml" xmlns:wp14="http://schemas.microsoft.com/office/word/2010/wordprocessingDrawing" xmlns:wp="http://schemas.openxmlformats.org/drawingml/2006/wordprocessingDrawing" xmlns:w10="urn:schemas-microsoft-com:office:word" xmlns:w="http://schemas.openxmlformats.org/wordprocessingml/2006/main" xmlns:w14="http://schemas.microsoft.com/office/word/2010/wordml" xmlns:w15="http://schemas.microsoft.com/office/word/2012/wordml" xmlns:w16cei="http://schemas.microsoft.com/office/word/2026/wordml/cei" xmlns:w16cex="http://schemas.microsoft.com/office/word/2018/wordml/cex" xmlns:w16cid="http://schemas.microsoft.com/office/word/2016/wordml/cid" xmlns:w16="http://schemas.microsoft.com/office/word/2018/wordml" xmlns:w16du="http://schemas.microsoft.com/office/word/2023/wordml/word16du" xmlns:w16sdtdh="http://schemas.microsoft.com/office/word/2020/wordml/sdtdatahash" xmlns:w16sdtfl="http://schemas.microsoft.com/office/word/2024/wordml/sdtformatlock" xmlns:w16se="http://schemas.microsoft.com/office/word/2015/wordml/symex" xmlns:wpg="http://schemas.microsoft.com/office/word/2010/wordprocessingGroup" xmlns:wpi="http://schemas.microsoft.com/office/word/2010/wordprocessingInk" xmlns:wne="http://schemas.microsoft.com/office/word/2006/wordml" xmlns:wps="http://schemas.microsoft.com/office/word/2010/wordprocessingShape" mc:Ignorable="w14 w15 w16se w16cid w16 w16cex w16sdtdh w16sdtfl w16du wp14">
+<w:endnotes xmlns:wpc="http://schemas.microsoft.com/office/word/2010/wordprocessingCanvas" xmlns:cx="http://schemas.microsoft.com/office/drawing/2014/chartex" xmlns:cx1="http://schemas.microsoft.com/office/drawing/2015/9/8/chartex" xmlns:cx2="http://schemas.microsoft.com/office/drawing/2015/10/21/chartex" xmlns:cx3="http://schemas.microsoft.com/office/drawing/2016/5/9/chartex" xmlns:cx4="http://schemas.microsoft.com/office/drawing/2016/5/10/chartex" xmlns:cx5="http://schemas.microsoft.com/office/drawing/2016/5/11/chartex" xmlns:cx6="http://schemas.microsoft.com/office/drawing/2016/5/12/chartex" xmlns:cx7="http://schemas.microsoft.com/office/drawing/2016/5/13/chartex" xmlns:cx8="http://schemas.microsoft.com/office/drawing/2016/5/14/chartex" xmlns:mc="http://schemas.openxmlformats.org/markup-compatibility/2006" xmlns:aink="http://schemas.microsoft.com/office/drawing/2016/ink" xmlns:am3d="http://schemas.microsoft.com/office/drawing/2017/model3d" xmlns:o="urn:schemas-microsoft-com:office:office" xmlns:oel="http://schemas.microsoft.com/office/2019/extlst" xmlns:r="http://schemas.openxmlformats.org/officeDocument/2006/relationships" xmlns:m="http://schemas.openxmlformats.org/officeDocument/2006/math" xmlns:v="urn:schemas-microsoft-com:vml" xmlns:wp14="http://schemas.microsoft.com/office/word/2010/wordprocessingDrawing" xmlns:wp="http://schemas.openxmlformats.org/drawingml/2006/wordprocessingDrawing" xmlns:w10="urn:schemas-microsoft-com:office:word" xmlns:w="http://schemas.openxmlformats.org/wordprocessingml/2006/main" xmlns:w14="http://schemas.microsoft.com/office/word/2010/wordml" xmlns:w15="http://schemas.microsoft.com/office/word/2012/wordml" xmlns:w16cex="http://schemas.microsoft.com/office/word/2018/wordml/cex" xmlns:w16cid="http://schemas.microsoft.com/office/word/2016/wordml/cid" xmlns:w16="http://schemas.microsoft.com/office/word/2018/wordml" xmlns:w16du="http://schemas.microsoft.com/office/word/2023/wordml/word16du" xmlns:w16sdtdh="http://schemas.microsoft.com/office/word/2020/wordml/sdtdatahash" xmlns:w16sdtfl="http://schemas.microsoft.com/office/word/2024/wordml/sdtformatlock" xmlns:w16se="http://schemas.microsoft.com/office/word/2015/wordml/symex" xmlns:wpg="http://schemas.microsoft.com/office/word/2010/wordprocessingGroup" xmlns:wpi="http://schemas.microsoft.com/office/word/2010/wordprocessingInk" xmlns:wne="http://schemas.microsoft.com/office/word/2006/wordml" xmlns:wps="http://schemas.microsoft.com/office/word/2010/wordprocessingShape" mc:Ignorable="w14 w15 w16se w16cid w16 w16cex w16sdtdh w16sdtfl w16du wp14">
   <w:endnote w:type="separator" w:id="-1">
     <w:p>
       <w:pPr>
@@ -1437,7 +1283,7 @@
 </file>
 
 <file path=word/footer1.xml><?xml version="1.0" encoding="utf-8"?>
-<w:ftr xmlns:wpc="http://schemas.microsoft.com/office/word/2010/wordprocessingCanvas" xmlns:cx="http://schemas.microsoft.com/office/drawing/2014/chartex" xmlns:cx1="http://schemas.microsoft.com/office/drawing/2015/9/8/chartex" xmlns:cx2="http://schemas.microsoft.com/office/drawing/2015/10/21/chartex" xmlns:cx3="http://schemas.microsoft.com/office/drawing/2016/5/9/chartex" xmlns:cx4="http://schemas.microsoft.com/office/drawing/2016/5/10/chartex" xmlns:cx5="http://schemas.microsoft.com/office/drawing/2016/5/11/chartex" xmlns:cx6="http://schemas.microsoft.com/office/drawing/2016/5/12/chartex" xmlns:cx7="http://schemas.microsoft.com/office/drawing/2016/5/13/chartex" xmlns:cx8="http://schemas.microsoft.com/office/drawing/2016/5/14/chartex" xmlns:mc="http://schemas.openxmlformats.org/markup-compatibility/2006" xmlns:aink="http://schemas.microsoft.com/office/drawing/2016/ink" xmlns:am3d="http://schemas.microsoft.com/office/drawing/2017/model3d" xmlns:o="urn:schemas-microsoft-com:office:office" xmlns:oel="http://schemas.microsoft.com/office/2019/extlst" xmlns:r="http://schemas.openxmlformats.org/officeDocument/2006/relationships" xmlns:m="http://schemas.openxmlformats.org/officeDocument/2006/math" xmlns:v="urn:schemas-microsoft-com:vml" xmlns:wp14="http://schemas.microsoft.com/office/word/2010/wordprocessingDrawing" xmlns:wp="http://schemas.openxmlformats.org/drawingml/2006/wordprocessingDrawing" xmlns:w10="urn:schemas-microsoft-com:office:word" xmlns:w="http://schemas.openxmlformats.org/wordprocessingml/2006/main" xmlns:w14="http://schemas.microsoft.com/office/word/2010/wordml" xmlns:w15="http://schemas.microsoft.com/office/word/2012/wordml" xmlns:w16cei="http://schemas.microsoft.com/office/word/2026/wordml/cei" xmlns:w16cex="http://schemas.microsoft.com/office/word/2018/wordml/cex" xmlns:w16cid="http://schemas.microsoft.com/office/word/2016/wordml/cid" xmlns:w16="http://schemas.microsoft.com/office/word/2018/wordml" xmlns:w16du="http://schemas.microsoft.com/office/word/2023/wordml/word16du" xmlns:w16sdtdh="http://schemas.microsoft.com/office/word/2020/wordml/sdtdatahash" xmlns:w16sdtfl="http://schemas.microsoft.com/office/word/2024/wordml/sdtformatlock" xmlns:w16se="http://schemas.microsoft.com/office/word/2015/wordml/symex" xmlns:wpg="http://schemas.microsoft.com/office/word/2010/wordprocessingGroup" xmlns:wpi="http://schemas.microsoft.com/office/word/2010/wordprocessingInk" xmlns:wne="http://schemas.microsoft.com/office/word/2006/wordml" xmlns:wps="http://schemas.microsoft.com/office/word/2010/wordprocessingShape" mc:Ignorable="w14 w15 w16se w16cid w16 w16cex w16sdtdh w16sdtfl w16du wp14">
+<w:ftr xmlns:wpc="http://schemas.microsoft.com/office/word/2010/wordprocessingCanvas" xmlns:cx="http://schemas.microsoft.com/office/drawing/2014/chartex" xmlns:cx1="http://schemas.microsoft.com/office/drawing/2015/9/8/chartex" xmlns:cx2="http://schemas.microsoft.com/office/drawing/2015/10/21/chartex" xmlns:cx3="http://schemas.microsoft.com/office/drawing/2016/5/9/chartex" xmlns:cx4="http://schemas.microsoft.com/office/drawing/2016/5/10/chartex" xmlns:cx5="http://schemas.microsoft.com/office/drawing/2016/5/11/chartex" xmlns:cx6="http://schemas.microsoft.com/office/drawing/2016/5/12/chartex" xmlns:cx7="http://schemas.microsoft.com/office/drawing/2016/5/13/chartex" xmlns:cx8="http://schemas.microsoft.com/office/drawing/2016/5/14/chartex" xmlns:mc="http://schemas.openxmlformats.org/markup-compatibility/2006" xmlns:aink="http://schemas.microsoft.com/office/drawing/2016/ink" xmlns:am3d="http://schemas.microsoft.com/office/drawing/2017/model3d" xmlns:o="urn:schemas-microsoft-com:office:office" xmlns:oel="http://schemas.microsoft.com/office/2019/extlst" xmlns:r="http://schemas.openxmlformats.org/officeDocument/2006/relationships" xmlns:m="http://schemas.openxmlformats.org/officeDocument/2006/math" xmlns:v="urn:schemas-microsoft-com:vml" xmlns:wp14="http://schemas.microsoft.com/office/word/2010/wordprocessingDrawing" xmlns:wp="http://schemas.openxmlformats.org/drawingml/2006/wordprocessingDrawing" xmlns:w10="urn:schemas-microsoft-com:office:word" xmlns:w="http://schemas.openxmlformats.org/wordprocessingml/2006/main" xmlns:w14="http://schemas.microsoft.com/office/word/2010/wordml" xmlns:w15="http://schemas.microsoft.com/office/word/2012/wordml" xmlns:w16cex="http://schemas.microsoft.com/office/word/2018/wordml/cex" xmlns:w16cid="http://schemas.microsoft.com/office/word/2016/wordml/cid" xmlns:w16="http://schemas.microsoft.com/office/word/2018/wordml" xmlns:w16du="http://schemas.microsoft.com/office/word/2023/wordml/word16du" xmlns:w16sdtdh="http://schemas.microsoft.com/office/word/2020/wordml/sdtdatahash" xmlns:w16sdtfl="http://schemas.microsoft.com/office/word/2024/wordml/sdtformatlock" xmlns:w16se="http://schemas.microsoft.com/office/word/2015/wordml/symex" xmlns:wpg="http://schemas.microsoft.com/office/word/2010/wordprocessingGroup" xmlns:wpi="http://schemas.microsoft.com/office/word/2010/wordprocessingInk" xmlns:wne="http://schemas.microsoft.com/office/word/2006/wordml" xmlns:wps="http://schemas.microsoft.com/office/word/2010/wordprocessingShape" mc:Ignorable="w14 w15 w16se w16cid w16 w16cex w16sdtdh w16sdtfl w16du wp14">
   <w:p>
     <w:pPr>
       <w:spacing w:after="0" w:line="259" w:lineRule="auto"/>
@@ -1472,7 +1318,151 @@
 </file>
 
 <file path=word/footer2.xml><?xml version="1.0" encoding="utf-8"?>
-<w:ftr xmlns:wpc="http://schemas.microsoft.com/office/word/2010/wordprocessingCanvas" xmlns:cx="http://schemas.microsoft.com/office/drawing/2014/chartex" xmlns:cx1="http://schemas.microsoft.com/office/drawing/2015/9/8/chartex" xmlns:cx2="http://schemas.microsoft.com/office/drawing/2015/10/21/chartex" xmlns:cx3="http://schemas.microsoft.com/office/drawing/2016/5/9/chartex" xmlns:cx4="http://schemas.microsoft.com/office/drawing/2016/5/10/chartex" xmlns:cx5="http://schemas.microsoft.com/office/drawing/2016/5/11/chartex" xmlns:cx6="http://schemas.microsoft.com/office/drawing/2016/5/12/chartex" xmlns:cx7="http://schemas.microsoft.com/office/drawing/2016/5/13/chartex" xmlns:cx8="http://schemas.microsoft.com/office/drawing/2016/5/14/chartex" xmlns:mc="http://schemas.openxmlformats.org/markup-compatibility/2006" xmlns:aink="http://schemas.microsoft.com/office/drawing/2016/ink" xmlns:am3d="http://schemas.microsoft.com/office/drawing/2017/model3d" xmlns:o="urn:schemas-microsoft-com:office:office" xmlns:oel="http://schemas.microsoft.com/office/2019/extlst" xmlns:r="http://schemas.openxmlformats.org/officeDocument/2006/relationships" xmlns:m="http://schemas.openxmlformats.org/officeDocument/2006/math" xmlns:v="urn:schemas-microsoft-com:vml" xmlns:wp14="http://schemas.microsoft.com/office/word/2010/wordprocessingDrawing" xmlns:wp="http://schemas.openxmlformats.org/drawingml/2006/wordprocessingDrawing" xmlns:w10="urn:schemas-microsoft-com:office:word" xmlns:w="http://schemas.openxmlformats.org/wordprocessingml/2006/main" xmlns:w14="http://schemas.microsoft.com/office/word/2010/wordml" xmlns:w15="http://schemas.microsoft.com/office/word/2012/wordml" xmlns:w16cei="http://schemas.microsoft.com/office/word/2026/wordml/cei" xmlns:w16cex="http://schemas.microsoft.com/office/word/2018/wordml/cex" xmlns:w16cid="http://schemas.microsoft.com/office/word/2016/wordml/cid" xmlns:w16="http://schemas.microsoft.com/office/word/2018/wordml" xmlns:w16du="http://schemas.microsoft.com/office/word/2023/wordml/word16du" xmlns:w16sdtdh="http://schemas.microsoft.com/office/word/2020/wordml/sdtdatahash" xmlns:w16sdtfl="http://schemas.microsoft.com/office/word/2024/wordml/sdtformatlock" xmlns:w16se="http://schemas.microsoft.com/office/word/2015/wordml/symex" xmlns:wpg="http://schemas.microsoft.com/office/word/2010/wordprocessingGroup" xmlns:wpi="http://schemas.microsoft.com/office/word/2010/wordprocessingInk" xmlns:wne="http://schemas.microsoft.com/office/word/2006/wordml" xmlns:wps="http://schemas.microsoft.com/office/word/2010/wordprocessingShape" mc:Ignorable="w14 w15 w16se w16cid w16 w16cex w16sdtdh w16sdtfl w16du wp14">
+<w:ftr xmlns:wpc="http://schemas.microsoft.com/office/word/2010/wordprocessingCanvas" xmlns:cx="http://schemas.microsoft.com/office/drawing/2014/chartex" xmlns:cx1="http://schemas.microsoft.com/office/drawing/2015/9/8/chartex" xmlns:cx2="http://schemas.microsoft.com/office/drawing/2015/10/21/chartex" xmlns:cx3="http://schemas.microsoft.com/office/drawing/2016/5/9/chartex" xmlns:cx4="http://schemas.microsoft.com/office/drawing/2016/5/10/chartex" xmlns:cx5="http://schemas.microsoft.com/office/drawing/2016/5/11/chartex" xmlns:cx6="http://schemas.microsoft.com/office/drawing/2016/5/12/chartex" xmlns:cx7="http://schemas.microsoft.com/office/drawing/2016/5/13/chartex" xmlns:cx8="http://schemas.microsoft.com/office/drawing/2016/5/14/chartex" xmlns:mc="http://schemas.openxmlformats.org/markup-compatibility/2006" xmlns:aink="http://schemas.microsoft.com/office/drawing/2016/ink" xmlns:am3d="http://schemas.microsoft.com/office/drawing/2017/model3d" xmlns:o="urn:schemas-microsoft-com:office:office" xmlns:oel="http://schemas.microsoft.com/office/2019/extlst" xmlns:r="http://schemas.openxmlformats.org/officeDocument/2006/relationships" xmlns:m="http://schemas.openxmlformats.org/officeDocument/2006/math" xmlns:v="urn:schemas-microsoft-com:vml" xmlns:wp14="http://schemas.microsoft.com/office/word/2010/wordprocessingDrawing" xmlns:wp="http://schemas.openxmlformats.org/drawingml/2006/wordprocessingDrawing" xmlns:w10="urn:schemas-microsoft-com:office:word" xmlns:w="http://schemas.openxmlformats.org/wordprocessingml/2006/main" xmlns:w14="http://schemas.microsoft.com/office/word/2010/wordml" xmlns:w15="http://schemas.microsoft.com/office/word/2012/wordml" xmlns:w16cex="http://schemas.microsoft.com/office/word/2018/wordml/cex" xmlns:w16cid="http://schemas.microsoft.com/office/word/2016/wordml/cid" xmlns:w16="http://schemas.microsoft.com/office/word/2018/wordml" xmlns:w16du="http://schemas.microsoft.com/office/word/2023/wordml/word16du" xmlns:w16sdtdh="http://schemas.microsoft.com/office/word/2020/wordml/sdtdatahash" xmlns:w16sdtfl="http://schemas.microsoft.com/office/word/2024/wordml/sdtformatlock" xmlns:w16se="http://schemas.microsoft.com/office/word/2015/wordml/symex" xmlns:wpg="http://schemas.microsoft.com/office/word/2010/wordprocessingGroup" xmlns:wpi="http://schemas.microsoft.com/office/word/2010/wordprocessingInk" xmlns:wne="http://schemas.microsoft.com/office/word/2006/wordml" xmlns:wps="http://schemas.microsoft.com/office/word/2010/wordprocessingShape" mc:Ignorable="w14 w15 w16se w16cid w16 w16cex w16sdtdh w16sdtfl w16du wp14">
+  <w:sdt>
+    <w:sdtPr>
+      <w:id w:val="-1441219081"/>
+      <w:docPartObj>
+        <w:docPartGallery w:val="Page Numbers (Bottom of Page)"/>
+        <w:docPartUnique/>
+      </w:docPartObj>
+    </w:sdtPr>
+    <w:sdtContent>
+      <w:sdt>
+        <w:sdtPr>
+          <w:id w:val="-1769616900"/>
+          <w:docPartObj>
+            <w:docPartGallery w:val="Page Numbers (Top of Page)"/>
+            <w:docPartUnique/>
+          </w:docPartObj>
+        </w:sdtPr>
+        <w:sdtContent>
+          <w:p>
+            <w:pPr>
+              <w:pStyle w:val="Footer"/>
+              <w:jc w:val="right"/>
+            </w:pPr>
+            <w:r>
+              <w:rPr>
+                <w:sz w:val="16"/>
+                <w:szCs w:val="16"/>
+              </w:rPr>
+              <w:t xml:space="preserve">Page </w:t>
+            </w:r>
+            <w:r>
+              <w:rPr>
+                <w:b/>
+                <w:bCs/>
+                <w:sz w:val="16"/>
+                <w:szCs w:val="16"/>
+              </w:rPr>
+              <w:fldChar w:fldCharType="begin"/>
+            </w:r>
+            <w:r>
+              <w:rPr>
+                <w:b/>
+                <w:bCs/>
+                <w:sz w:val="16"/>
+                <w:szCs w:val="16"/>
+              </w:rPr>
+              <w:instrText xml:space="preserve"> PAGE  \* Arabic </w:instrText>
+            </w:r>
+            <w:r>
+              <w:rPr>
+                <w:b/>
+                <w:bCs/>
+                <w:sz w:val="16"/>
+                <w:szCs w:val="16"/>
+              </w:rPr>
+              <w:fldChar w:fldCharType="separate"/>
+            </w:r>
+            <w:r>
+              <w:rPr>
+                <w:b/>
+                <w:bCs/>
+                <w:noProof/>
+                <w:sz w:val="16"/>
+                <w:szCs w:val="16"/>
+              </w:rPr>
+              <w:t>1</w:t>
+            </w:r>
+            <w:r>
+              <w:rPr>
+                <w:b/>
+                <w:bCs/>
+                <w:sz w:val="16"/>
+                <w:szCs w:val="16"/>
+              </w:rPr>
+              <w:fldChar w:fldCharType="end"/>
+            </w:r>
+            <w:r>
+              <w:rPr>
+                <w:sz w:val="16"/>
+                <w:szCs w:val="16"/>
+              </w:rPr>
+              <w:t xml:space="preserve"> of </w:t>
+            </w:r>
+            <w:r>
+              <w:rPr>
+                <w:b/>
+                <w:bCs/>
+                <w:sz w:val="16"/>
+                <w:szCs w:val="16"/>
+              </w:rPr>
+              <w:fldChar w:fldCharType="begin"/>
+            </w:r>
+            <w:r>
+              <w:rPr>
+                <w:b/>
+                <w:bCs/>
+                <w:sz w:val="16"/>
+                <w:szCs w:val="16"/>
+              </w:rPr>
+              <w:instrText xml:space="preserve"> NUMPAGES  </w:instrText>
+            </w:r>
+            <w:r>
+              <w:rPr>
+                <w:b/>
+                <w:bCs/>
+                <w:sz w:val="16"/>
+                <w:szCs w:val="16"/>
+              </w:rPr>
+              <w:fldChar w:fldCharType="separate"/>
+            </w:r>
+            <w:r>
+              <w:rPr>
+                <w:b/>
+                <w:bCs/>
+                <w:noProof/>
+                <w:sz w:val="16"/>
+                <w:szCs w:val="16"/>
+              </w:rPr>
+              <w:t>2</w:t>
+            </w:r>
+            <w:r>
+              <w:rPr>
+                <w:b/>
+                <w:bCs/>
+                <w:sz w:val="16"/>
+                <w:szCs w:val="16"/>
+              </w:rPr>
+              <w:fldChar w:fldCharType="end"/>
+            </w:r>
+          </w:p>
+        </w:sdtContent>
+      </w:sdt>
+    </w:sdtContent>
+  </w:sdt>
+  <w:p>
+    <w:pPr>
+      <w:pStyle w:val="Footer"/>
+    </w:pPr>
+  </w:p>
+</w:ftr>
+</file>
+
+<file path=word/footer3.xml><?xml version="1.0" encoding="utf-8"?>
+<w:ftr xmlns:wpc="http://schemas.microsoft.com/office/word/2010/wordprocessingCanvas" xmlns:cx="http://schemas.microsoft.com/office/drawing/2014/chartex" xmlns:cx1="http://schemas.microsoft.com/office/drawing/2015/9/8/chartex" xmlns:cx2="http://schemas.microsoft.com/office/drawing/2015/10/21/chartex" xmlns:cx3="http://schemas.microsoft.com/office/drawing/2016/5/9/chartex" xmlns:cx4="http://schemas.microsoft.com/office/drawing/2016/5/10/chartex" xmlns:cx5="http://schemas.microsoft.com/office/drawing/2016/5/11/chartex" xmlns:cx6="http://schemas.microsoft.com/office/drawing/2016/5/12/chartex" xmlns:cx7="http://schemas.microsoft.com/office/drawing/2016/5/13/chartex" xmlns:cx8="http://schemas.microsoft.com/office/drawing/2016/5/14/chartex" xmlns:mc="http://schemas.openxmlformats.org/markup-compatibility/2006" xmlns:aink="http://schemas.microsoft.com/office/drawing/2016/ink" xmlns:am3d="http://schemas.microsoft.com/office/drawing/2017/model3d" xmlns:o="urn:schemas-microsoft-com:office:office" xmlns:oel="http://schemas.microsoft.com/office/2019/extlst" xmlns:r="http://schemas.openxmlformats.org/officeDocument/2006/relationships" xmlns:m="http://schemas.openxmlformats.org/officeDocument/2006/math" xmlns:v="urn:schemas-microsoft-com:vml" xmlns:wp14="http://schemas.microsoft.com/office/word/2010/wordprocessingDrawing" xmlns:wp="http://schemas.openxmlformats.org/drawingml/2006/wordprocessingDrawing" xmlns:w10="urn:schemas-microsoft-com:office:word" xmlns:w="http://schemas.openxmlformats.org/wordprocessingml/2006/main" xmlns:w14="http://schemas.microsoft.com/office/word/2010/wordml" xmlns:w15="http://schemas.microsoft.com/office/word/2012/wordml" xmlns:w16cex="http://schemas.microsoft.com/office/word/2018/wordml/cex" xmlns:w16cid="http://schemas.microsoft.com/office/word/2016/wordml/cid" xmlns:w16="http://schemas.microsoft.com/office/word/2018/wordml" xmlns:w16du="http://schemas.microsoft.com/office/word/2023/wordml/word16du" xmlns:w16sdtdh="http://schemas.microsoft.com/office/word/2020/wordml/sdtdatahash" xmlns:w16sdtfl="http://schemas.microsoft.com/office/word/2024/wordml/sdtformatlock" xmlns:w16se="http://schemas.microsoft.com/office/word/2015/wordml/symex" xmlns:wpg="http://schemas.microsoft.com/office/word/2010/wordprocessingGroup" xmlns:wpi="http://schemas.microsoft.com/office/word/2010/wordprocessingInk" xmlns:wne="http://schemas.microsoft.com/office/word/2006/wordml" xmlns:wps="http://schemas.microsoft.com/office/word/2010/wordprocessingShape" mc:Ignorable="w14 w15 w16se w16cid w16 w16cex w16sdtdh w16sdtfl w16du wp14">
   <w:p>
     <w:pPr>
       <w:spacing w:after="0" w:line="259" w:lineRule="auto"/>
@@ -1506,43 +1496,8 @@
 </w:ftr>
 </file>
 
-<file path=word/footer3.xml><?xml version="1.0" encoding="utf-8"?>
-<w:ftr xmlns:wpc="http://schemas.microsoft.com/office/word/2010/wordprocessingCanvas" xmlns:cx="http://schemas.microsoft.com/office/drawing/2014/chartex" xmlns:cx1="http://schemas.microsoft.com/office/drawing/2015/9/8/chartex" xmlns:cx2="http://schemas.microsoft.com/office/drawing/2015/10/21/chartex" xmlns:cx3="http://schemas.microsoft.com/office/drawing/2016/5/9/chartex" xmlns:cx4="http://schemas.microsoft.com/office/drawing/2016/5/10/chartex" xmlns:cx5="http://schemas.microsoft.com/office/drawing/2016/5/11/chartex" xmlns:cx6="http://schemas.microsoft.com/office/drawing/2016/5/12/chartex" xmlns:cx7="http://schemas.microsoft.com/office/drawing/2016/5/13/chartex" xmlns:cx8="http://schemas.microsoft.com/office/drawing/2016/5/14/chartex" xmlns:mc="http://schemas.openxmlformats.org/markup-compatibility/2006" xmlns:aink="http://schemas.microsoft.com/office/drawing/2016/ink" xmlns:am3d="http://schemas.microsoft.com/office/drawing/2017/model3d" xmlns:o="urn:schemas-microsoft-com:office:office" xmlns:oel="http://schemas.microsoft.com/office/2019/extlst" xmlns:r="http://schemas.openxmlformats.org/officeDocument/2006/relationships" xmlns:m="http://schemas.openxmlformats.org/officeDocument/2006/math" xmlns:v="urn:schemas-microsoft-com:vml" xmlns:wp14="http://schemas.microsoft.com/office/word/2010/wordprocessingDrawing" xmlns:wp="http://schemas.openxmlformats.org/drawingml/2006/wordprocessingDrawing" xmlns:w10="urn:schemas-microsoft-com:office:word" xmlns:w="http://schemas.openxmlformats.org/wordprocessingml/2006/main" xmlns:w14="http://schemas.microsoft.com/office/word/2010/wordml" xmlns:w15="http://schemas.microsoft.com/office/word/2012/wordml" xmlns:w16cei="http://schemas.microsoft.com/office/word/2026/wordml/cei" xmlns:w16cex="http://schemas.microsoft.com/office/word/2018/wordml/cex" xmlns:w16cid="http://schemas.microsoft.com/office/word/2016/wordml/cid" xmlns:w16="http://schemas.microsoft.com/office/word/2018/wordml" xmlns:w16du="http://schemas.microsoft.com/office/word/2023/wordml/word16du" xmlns:w16sdtdh="http://schemas.microsoft.com/office/word/2020/wordml/sdtdatahash" xmlns:w16sdtfl="http://schemas.microsoft.com/office/word/2024/wordml/sdtformatlock" xmlns:w16se="http://schemas.microsoft.com/office/word/2015/wordml/symex" xmlns:wpg="http://schemas.microsoft.com/office/word/2010/wordprocessingGroup" xmlns:wpi="http://schemas.microsoft.com/office/word/2010/wordprocessingInk" xmlns:wne="http://schemas.microsoft.com/office/word/2006/wordml" xmlns:wps="http://schemas.microsoft.com/office/word/2010/wordprocessingShape" mc:Ignorable="w14 w15 w16se w16cid w16 w16cex w16sdtdh w16sdtfl w16du wp14">
-  <w:p>
-    <w:pPr>
-      <w:spacing w:after="0" w:line="259" w:lineRule="auto"/>
-      <w:ind w:left="0" w:right="-34" w:firstLine="0"/>
-      <w:jc w:val="right"/>
-    </w:pPr>
-    <w:r>
-      <w:fldChar w:fldCharType="begin"/>
-    </w:r>
-    <w:r>
-      <w:instrText xml:space="preserve"> PAGE   \* MERGEFORMAT </w:instrText>
-    </w:r>
-    <w:r>
-      <w:fldChar w:fldCharType="separate"/>
-    </w:r>
-    <w:r>
-      <w:rPr>
-        <w:color w:val="8C8C8C"/>
-        <w:sz w:val="14"/>
-      </w:rPr>
-      <w:t>1</w:t>
-    </w:r>
-    <w:r>
-      <w:rPr>
-        <w:color w:val="8C8C8C"/>
-        <w:sz w:val="14"/>
-      </w:rPr>
-      <w:fldChar w:fldCharType="end"/>
-    </w:r>
-  </w:p>
-</w:ftr>
-</file>
-
 <file path=word/footnotes.xml><?xml version="1.0" encoding="utf-8"?>
-<w:footnotes xmlns:wpc="http://schemas.microsoft.com/office/word/2010/wordprocessingCanvas" xmlns:cx="http://schemas.microsoft.com/office/drawing/2014/chartex" xmlns:cx1="http://schemas.microsoft.com/office/drawing/2015/9/8/chartex" xmlns:cx2="http://schemas.microsoft.com/office/drawing/2015/10/21/chartex" xmlns:cx3="http://schemas.microsoft.com/office/drawing/2016/5/9/chartex" xmlns:cx4="http://schemas.microsoft.com/office/drawing/2016/5/10/chartex" xmlns:cx5="http://schemas.microsoft.com/office/drawing/2016/5/11/chartex" xmlns:cx6="http://schemas.microsoft.com/office/drawing/2016/5/12/chartex" xmlns:cx7="http://schemas.microsoft.com/office/drawing/2016/5/13/chartex" xmlns:cx8="http://schemas.microsoft.com/office/drawing/2016/5/14/chartex" xmlns:mc="http://schemas.openxmlformats.org/markup-compatibility/2006" xmlns:aink="http://schemas.microsoft.com/office/drawing/2016/ink" xmlns:am3d="http://schemas.microsoft.com/office/drawing/2017/model3d" xmlns:o="urn:schemas-microsoft-com:office:office" xmlns:oel="http://schemas.microsoft.com/office/2019/extlst" xmlns:r="http://schemas.openxmlformats.org/officeDocument/2006/relationships" xmlns:m="http://schemas.openxmlformats.org/officeDocument/2006/math" xmlns:v="urn:schemas-microsoft-com:vml" xmlns:wp14="http://schemas.microsoft.com/office/word/2010/wordprocessingDrawing" xmlns:wp="http://schemas.openxmlformats.org/drawingml/2006/wordprocessingDrawing" xmlns:w10="urn:schemas-microsoft-com:office:word" xmlns:w="http://schemas.openxmlformats.org/wordprocessingml/2006/main" xmlns:w14="http://schemas.microsoft.com/office/word/2010/wordml" xmlns:w15="http://schemas.microsoft.com/office/word/2012/wordml" xmlns:w16cei="http://schemas.microsoft.com/office/word/2026/wordml/cei" xmlns:w16cex="http://schemas.microsoft.com/office/word/2018/wordml/cex" xmlns:w16cid="http://schemas.microsoft.com/office/word/2016/wordml/cid" xmlns:w16="http://schemas.microsoft.com/office/word/2018/wordml" xmlns:w16du="http://schemas.microsoft.com/office/word/2023/wordml/word16du" xmlns:w16sdtdh="http://schemas.microsoft.com/office/word/2020/wordml/sdtdatahash" xmlns:w16sdtfl="http://schemas.microsoft.com/office/word/2024/wordml/sdtformatlock" xmlns:w16se="http://schemas.microsoft.com/office/word/2015/wordml/symex" xmlns:wpg="http://schemas.microsoft.com/office/word/2010/wordprocessingGroup" xmlns:wpi="http://schemas.microsoft.com/office/word/2010/wordprocessingInk" xmlns:wne="http://schemas.microsoft.com/office/word/2006/wordml" xmlns:wps="http://schemas.microsoft.com/office/word/2010/wordprocessingShape" mc:Ignorable="w14 w15 w16se w16cid w16 w16cex w16sdtdh w16sdtfl w16du wp14">
+<w:footnotes xmlns:wpc="http://schemas.microsoft.com/office/word/2010/wordprocessingCanvas" xmlns:cx="http://schemas.microsoft.com/office/drawing/2014/chartex" xmlns:cx1="http://schemas.microsoft.com/office/drawing/2015/9/8/chartex" xmlns:cx2="http://schemas.microsoft.com/office/drawing/2015/10/21/chartex" xmlns:cx3="http://schemas.microsoft.com/office/drawing/2016/5/9/chartex" xmlns:cx4="http://schemas.microsoft.com/office/drawing/2016/5/10/chartex" xmlns:cx5="http://schemas.microsoft.com/office/drawing/2016/5/11/chartex" xmlns:cx6="http://schemas.microsoft.com/office/drawing/2016/5/12/chartex" xmlns:cx7="http://schemas.microsoft.com/office/drawing/2016/5/13/chartex" xmlns:cx8="http://schemas.microsoft.com/office/drawing/2016/5/14/chartex" xmlns:mc="http://schemas.openxmlformats.org/markup-compatibility/2006" xmlns:aink="http://schemas.microsoft.com/office/drawing/2016/ink" xmlns:am3d="http://schemas.microsoft.com/office/drawing/2017/model3d" xmlns:o="urn:schemas-microsoft-com:office:office" xmlns:oel="http://schemas.microsoft.com/office/2019/extlst" xmlns:r="http://schemas.openxmlformats.org/officeDocument/2006/relationships" xmlns:m="http://schemas.openxmlformats.org/officeDocument/2006/math" xmlns:v="urn:schemas-microsoft-com:vml" xmlns:wp14="http://schemas.microsoft.com/office/word/2010/wordprocessingDrawing" xmlns:wp="http://schemas.openxmlformats.org/drawingml/2006/wordprocessingDrawing" xmlns:w10="urn:schemas-microsoft-com:office:word" xmlns:w="http://schemas.openxmlformats.org/wordprocessingml/2006/main" xmlns:w14="http://schemas.microsoft.com/office/word/2010/wordml" xmlns:w15="http://schemas.microsoft.com/office/word/2012/wordml" xmlns:w16cex="http://schemas.microsoft.com/office/word/2018/wordml/cex" xmlns:w16cid="http://schemas.microsoft.com/office/word/2016/wordml/cid" xmlns:w16="http://schemas.microsoft.com/office/word/2018/wordml" xmlns:w16du="http://schemas.microsoft.com/office/word/2023/wordml/word16du" xmlns:w16sdtdh="http://schemas.microsoft.com/office/word/2020/wordml/sdtdatahash" xmlns:w16sdtfl="http://schemas.microsoft.com/office/word/2024/wordml/sdtformatlock" xmlns:w16se="http://schemas.microsoft.com/office/word/2015/wordml/symex" xmlns:wpg="http://schemas.microsoft.com/office/word/2010/wordprocessingGroup" xmlns:wpi="http://schemas.microsoft.com/office/word/2010/wordprocessingInk" xmlns:wne="http://schemas.microsoft.com/office/word/2006/wordml" xmlns:wps="http://schemas.microsoft.com/office/word/2010/wordprocessingShape" mc:Ignorable="w14 w15 w16se w16cid w16 w16cex w16sdtdh w16sdtfl w16du wp14">
   <w:footnote w:type="separator" w:id="-1">
     <w:p>
       <w:pPr>
@@ -1567,7 +1522,7 @@
 </file>
 
 <file path=word/numbering.xml><?xml version="1.0" encoding="utf-8"?>
-<w:numbering xmlns:wpc="http://schemas.microsoft.com/office/word/2010/wordprocessingCanvas" xmlns:cx="http://schemas.microsoft.com/office/drawing/2014/chartex" xmlns:cx1="http://schemas.microsoft.com/office/drawing/2015/9/8/chartex" xmlns:cx2="http://schemas.microsoft.com/office/drawing/2015/10/21/chartex" xmlns:cx3="http://schemas.microsoft.com/office/drawing/2016/5/9/chartex" xmlns:cx4="http://schemas.microsoft.com/office/drawing/2016/5/10/chartex" xmlns:cx5="http://schemas.microsoft.com/office/drawing/2016/5/11/chartex" xmlns:cx6="http://schemas.microsoft.com/office/drawing/2016/5/12/chartex" xmlns:cx7="http://schemas.microsoft.com/office/drawing/2016/5/13/chartex" xmlns:cx8="http://schemas.microsoft.com/office/drawing/2016/5/14/chartex" xmlns:mc="http://schemas.openxmlformats.org/markup-compatibility/2006" xmlns:aink="http://schemas.microsoft.com/office/drawing/2016/ink" xmlns:am3d="http://schemas.microsoft.com/office/drawing/2017/model3d" xmlns:o="urn:schemas-microsoft-com:office:office" xmlns:oel="http://schemas.microsoft.com/office/2019/extlst" xmlns:r="http://schemas.openxmlformats.org/officeDocument/2006/relationships" xmlns:m="http://schemas.openxmlformats.org/officeDocument/2006/math" xmlns:v="urn:schemas-microsoft-com:vml" xmlns:wp14="http://schemas.microsoft.com/office/word/2010/wordprocessingDrawing" xmlns:wp="http://schemas.openxmlformats.org/drawingml/2006/wordprocessingDrawing" xmlns:w10="urn:schemas-microsoft-com:office:word" xmlns:w="http://schemas.openxmlformats.org/wordprocessingml/2006/main" xmlns:w14="http://schemas.microsoft.com/office/word/2010/wordml" xmlns:w15="http://schemas.microsoft.com/office/word/2012/wordml" xmlns:w16cei="http://schemas.microsoft.com/office/word/2026/wordml/cei" xmlns:w16cex="http://schemas.microsoft.com/office/word/2018/wordml/cex" xmlns:w16cid="http://schemas.microsoft.com/office/word/2016/wordml/cid" xmlns:w16="http://schemas.microsoft.com/office/word/2018/wordml" xmlns:w16du="http://schemas.microsoft.com/office/word/2023/wordml/word16du" xmlns:w16sdtdh="http://schemas.microsoft.com/office/word/2020/wordml/sdtdatahash" xmlns:w16sdtfl="http://schemas.microsoft.com/office/word/2024/wordml/sdtformatlock" xmlns:w16se="http://schemas.microsoft.com/office/word/2015/wordml/symex" xmlns:wpg="http://schemas.microsoft.com/office/word/2010/wordprocessingGroup" xmlns:wpi="http://schemas.microsoft.com/office/word/2010/wordprocessingInk" xmlns:wne="http://schemas.microsoft.com/office/word/2006/wordml" xmlns:wps="http://schemas.microsoft.com/office/word/2010/wordprocessingShape" mc:Ignorable="w14 w15 w16se w16cid w16 w16cex w16sdtdh w16sdtfl w16du wp14">
+<w:numbering xmlns:wpc="http://schemas.microsoft.com/office/word/2010/wordprocessingCanvas" xmlns:cx="http://schemas.microsoft.com/office/drawing/2014/chartex" xmlns:cx1="http://schemas.microsoft.com/office/drawing/2015/9/8/chartex" xmlns:cx2="http://schemas.microsoft.com/office/drawing/2015/10/21/chartex" xmlns:cx3="http://schemas.microsoft.com/office/drawing/2016/5/9/chartex" xmlns:cx4="http://schemas.microsoft.com/office/drawing/2016/5/10/chartex" xmlns:cx5="http://schemas.microsoft.com/office/drawing/2016/5/11/chartex" xmlns:cx6="http://schemas.microsoft.com/office/drawing/2016/5/12/chartex" xmlns:cx7="http://schemas.microsoft.com/office/drawing/2016/5/13/chartex" xmlns:cx8="http://schemas.microsoft.com/office/drawing/2016/5/14/chartex" xmlns:mc="http://schemas.openxmlformats.org/markup-compatibility/2006" xmlns:aink="http://schemas.microsoft.com/office/drawing/2016/ink" xmlns:am3d="http://schemas.microsoft.com/office/drawing/2017/model3d" xmlns:o="urn:schemas-microsoft-com:office:office" xmlns:oel="http://schemas.microsoft.com/office/2019/extlst" xmlns:r="http://schemas.openxmlformats.org/officeDocument/2006/relationships" xmlns:m="http://schemas.openxmlformats.org/officeDocument/2006/math" xmlns:v="urn:schemas-microsoft-com:vml" xmlns:wp14="http://schemas.microsoft.com/office/word/2010/wordprocessingDrawing" xmlns:wp="http://schemas.openxmlformats.org/drawingml/2006/wordprocessingDrawing" xmlns:w10="urn:schemas-microsoft-com:office:word" xmlns:w="http://schemas.openxmlformats.org/wordprocessingml/2006/main" xmlns:w14="http://schemas.microsoft.com/office/word/2010/wordml" xmlns:w15="http://schemas.microsoft.com/office/word/2012/wordml" xmlns:w16cex="http://schemas.microsoft.com/office/word/2018/wordml/cex" xmlns:w16cid="http://schemas.microsoft.com/office/word/2016/wordml/cid" xmlns:w16="http://schemas.microsoft.com/office/word/2018/wordml" xmlns:w16du="http://schemas.microsoft.com/office/word/2023/wordml/word16du" xmlns:w16sdtdh="http://schemas.microsoft.com/office/word/2020/wordml/sdtdatahash" xmlns:w16sdtfl="http://schemas.microsoft.com/office/word/2024/wordml/sdtformatlock" xmlns:w16se="http://schemas.microsoft.com/office/word/2015/wordml/symex" xmlns:wpg="http://schemas.microsoft.com/office/word/2010/wordprocessingGroup" xmlns:wpi="http://schemas.microsoft.com/office/word/2010/wordprocessingInk" xmlns:wne="http://schemas.microsoft.com/office/word/2006/wordml" xmlns:wps="http://schemas.microsoft.com/office/word/2010/wordprocessingShape" mc:Ignorable="w14 w15 w16se w16cid w16 w16cex w16sdtdh w16sdtfl w16du wp14">
   <w:abstractNum w:abstractNumId="0" w15:restartNumberingAfterBreak="0">
     <w:nsid w:val="1A061A57"/>
     <w:multiLevelType w:val="hybridMultilevel"/>
@@ -2663,6 +2618,60 @@
       <w:shd w:val="clear" w:color="auto" w:fill="E1DFDD"/>
     </w:rPr>
   </w:style>
+  <w:style w:type="paragraph" w:styleId="Header">
+    <w:name w:val="header"/>
+    <w:basedOn w:val="Normal"/>
+    <w:link w:val="HeaderChar"/>
+    <w:uiPriority w:val="99"/>
+    <w:unhideWhenUsed/>
+    <w:rsid w:val="00127824"/>
+    <w:pPr>
+      <w:tabs>
+        <w:tab w:val="center" w:pos="4680"/>
+        <w:tab w:val="right" w:pos="9360"/>
+      </w:tabs>
+      <w:spacing w:after="0" w:line="240" w:lineRule="auto"/>
+    </w:pPr>
+  </w:style>
+  <w:style w:type="character" w:customStyle="1" w:styleId="HeaderChar">
+    <w:name w:val="Header Char"/>
+    <w:basedOn w:val="DefaultParagraphFont"/>
+    <w:link w:val="Header"/>
+    <w:uiPriority w:val="99"/>
+    <w:rsid w:val="00127824"/>
+    <w:rPr>
+      <w:rFonts w:ascii="Arial" w:eastAsia="Arial" w:hAnsi="Arial" w:cs="Arial"/>
+      <w:color w:val="000000"/>
+      <w:sz w:val="17"/>
+    </w:rPr>
+  </w:style>
+  <w:style w:type="paragraph" w:styleId="Footer">
+    <w:name w:val="footer"/>
+    <w:basedOn w:val="Normal"/>
+    <w:link w:val="FooterChar"/>
+    <w:uiPriority w:val="99"/>
+    <w:unhideWhenUsed/>
+    <w:rsid w:val="00127824"/>
+    <w:pPr>
+      <w:tabs>
+        <w:tab w:val="center" w:pos="4680"/>
+        <w:tab w:val="right" w:pos="9360"/>
+      </w:tabs>
+      <w:spacing w:after="0" w:line="240" w:lineRule="auto"/>
+    </w:pPr>
+  </w:style>
+  <w:style w:type="character" w:customStyle="1" w:styleId="FooterChar">
+    <w:name w:val="Footer Char"/>
+    <w:basedOn w:val="DefaultParagraphFont"/>
+    <w:link w:val="Footer"/>
+    <w:uiPriority w:val="99"/>
+    <w:rsid w:val="00127824"/>
+    <w:rPr>
+      <w:rFonts w:ascii="Arial" w:eastAsia="Arial" w:hAnsi="Arial" w:cs="Arial"/>
+      <w:color w:val="000000"/>
+      <w:sz w:val="17"/>
+    </w:rPr>
+  </w:style>
 </w:styles>
 </file>
 

</xml_diff>